<commit_message>
Inicio de descrição do relatório, e criação do README.
</commit_message>
<xml_diff>
--- a/RELATORIO PROJETO.docx
+++ b/RELATORIO PROJETO.docx
@@ -5,9 +5,13 @@
     <w:p>
       <w:pPr>
         <w:jc w:val="center"/>
-      </w:pPr>
-      <w:r>
-        <w:rPr>
+        <w:rPr>
+          <w:rFonts w:ascii="Arial" w:hAnsi="Arial" w:cs="Arial"/>
+        </w:rPr>
+      </w:pPr>
+      <w:r>
+        <w:rPr>
+          <w:rFonts w:ascii="Arial" w:hAnsi="Arial" w:cs="Arial"/>
           <w:noProof/>
         </w:rPr>
         <w:drawing>
@@ -78,28 +82,39 @@
     <w:p>
       <w:pPr>
         <w:jc w:val="center"/>
+        <w:rPr>
+          <w:rFonts w:ascii="Arial" w:hAnsi="Arial" w:cs="Arial"/>
+        </w:rPr>
       </w:pPr>
     </w:p>
     <w:p>
       <w:pPr>
         <w:jc w:val="center"/>
+        <w:rPr>
+          <w:rFonts w:ascii="Arial" w:hAnsi="Arial" w:cs="Arial"/>
+        </w:rPr>
       </w:pPr>
     </w:p>
     <w:p>
       <w:pPr>
         <w:jc w:val="center"/>
+        <w:rPr>
+          <w:rFonts w:ascii="Arial" w:hAnsi="Arial" w:cs="Arial"/>
+        </w:rPr>
       </w:pPr>
     </w:p>
     <w:p>
       <w:pPr>
         <w:jc w:val="center"/>
         <w:rPr>
+          <w:rFonts w:ascii="Arial" w:hAnsi="Arial" w:cs="Arial"/>
           <w:b/>
           <w:bCs/>
         </w:rPr>
       </w:pPr>
       <w:r>
         <w:rPr>
+          <w:rFonts w:ascii="Arial" w:hAnsi="Arial" w:cs="Arial"/>
           <w:b/>
           <w:bCs/>
         </w:rPr>
@@ -109,32 +124,48 @@
     <w:p>
       <w:pPr>
         <w:jc w:val="center"/>
+        <w:rPr>
+          <w:rFonts w:ascii="Arial" w:hAnsi="Arial" w:cs="Arial"/>
+        </w:rPr>
       </w:pPr>
     </w:p>
     <w:p>
       <w:pPr>
         <w:jc w:val="center"/>
+        <w:rPr>
+          <w:rFonts w:ascii="Arial" w:hAnsi="Arial" w:cs="Arial"/>
+        </w:rPr>
       </w:pPr>
     </w:p>
     <w:p>
       <w:pPr>
         <w:jc w:val="center"/>
+        <w:rPr>
+          <w:rFonts w:ascii="Arial" w:hAnsi="Arial" w:cs="Arial"/>
+        </w:rPr>
       </w:pPr>
     </w:p>
     <w:p>
       <w:pPr>
         <w:jc w:val="center"/>
+        <w:rPr>
+          <w:rFonts w:ascii="Arial" w:hAnsi="Arial" w:cs="Arial"/>
+        </w:rPr>
       </w:pPr>
     </w:p>
     <w:p>
       <w:pPr>
         <w:jc w:val="center"/>
+        <w:rPr>
+          <w:rFonts w:ascii="Arial" w:hAnsi="Arial" w:cs="Arial"/>
+        </w:rPr>
       </w:pPr>
     </w:p>
     <w:p>
       <w:pPr>
         <w:jc w:val="center"/>
         <w:rPr>
+          <w:rFonts w:ascii="Arial" w:hAnsi="Arial" w:cs="Arial"/>
           <w:b/>
           <w:bCs/>
           <w:sz w:val="32"/>
@@ -143,6 +174,7 @@
       </w:pPr>
       <w:r>
         <w:rPr>
+          <w:rFonts w:ascii="Arial" w:hAnsi="Arial" w:cs="Arial"/>
           <w:b/>
           <w:bCs/>
           <w:sz w:val="32"/>
@@ -152,6 +184,7 @@
       </w:r>
       <w:r>
         <w:rPr>
+          <w:rFonts w:ascii="Arial" w:hAnsi="Arial" w:cs="Arial"/>
           <w:b/>
           <w:bCs/>
           <w:sz w:val="32"/>
@@ -161,6 +194,7 @@
       </w:r>
       <w:r>
         <w:rPr>
+          <w:rFonts w:ascii="Arial" w:hAnsi="Arial" w:cs="Arial"/>
           <w:b/>
           <w:bCs/>
           <w:sz w:val="32"/>
@@ -170,6 +204,7 @@
       </w:r>
       <w:r>
         <w:rPr>
+          <w:rFonts w:ascii="Arial" w:hAnsi="Arial" w:cs="Arial"/>
           <w:b/>
           <w:bCs/>
           <w:sz w:val="32"/>
@@ -179,6 +214,7 @@
       </w:r>
       <w:r>
         <w:rPr>
+          <w:rFonts w:ascii="Arial" w:hAnsi="Arial" w:cs="Arial"/>
           <w:b/>
           <w:bCs/>
           <w:sz w:val="32"/>
@@ -191,12 +227,14 @@
       <w:pPr>
         <w:jc w:val="center"/>
         <w:rPr>
+          <w:rFonts w:ascii="Arial" w:hAnsi="Arial" w:cs="Arial"/>
           <w:sz w:val="32"/>
           <w:szCs w:val="32"/>
         </w:rPr>
       </w:pPr>
       <w:r>
         <w:rPr>
+          <w:rFonts w:ascii="Arial" w:hAnsi="Arial" w:cs="Arial"/>
           <w:sz w:val="32"/>
           <w:szCs w:val="32"/>
         </w:rPr>
@@ -207,6 +245,7 @@
       <w:pPr>
         <w:jc w:val="center"/>
         <w:rPr>
+          <w:rFonts w:ascii="Arial" w:hAnsi="Arial" w:cs="Arial"/>
           <w:sz w:val="32"/>
           <w:szCs w:val="32"/>
         </w:rPr>
@@ -216,6 +255,7 @@
       <w:pPr>
         <w:jc w:val="center"/>
         <w:rPr>
+          <w:rFonts w:ascii="Arial" w:hAnsi="Arial" w:cs="Arial"/>
           <w:sz w:val="32"/>
           <w:szCs w:val="32"/>
         </w:rPr>
@@ -225,6 +265,7 @@
       <w:pPr>
         <w:jc w:val="center"/>
         <w:rPr>
+          <w:rFonts w:ascii="Arial" w:hAnsi="Arial" w:cs="Arial"/>
           <w:sz w:val="32"/>
           <w:szCs w:val="32"/>
         </w:rPr>
@@ -234,6 +275,7 @@
       <w:pPr>
         <w:jc w:val="center"/>
         <w:rPr>
+          <w:rFonts w:ascii="Arial" w:hAnsi="Arial" w:cs="Arial"/>
           <w:sz w:val="32"/>
           <w:szCs w:val="32"/>
         </w:rPr>
@@ -243,6 +285,7 @@
       <w:pPr>
         <w:jc w:val="center"/>
         <w:rPr>
+          <w:rFonts w:ascii="Arial" w:hAnsi="Arial" w:cs="Arial"/>
           <w:sz w:val="32"/>
           <w:szCs w:val="32"/>
         </w:rPr>
@@ -252,6 +295,7 @@
       <w:pPr>
         <w:jc w:val="center"/>
         <w:rPr>
+          <w:rFonts w:ascii="Arial" w:hAnsi="Arial" w:cs="Arial"/>
           <w:sz w:val="32"/>
           <w:szCs w:val="32"/>
         </w:rPr>
@@ -261,6 +305,7 @@
       <w:pPr>
         <w:jc w:val="center"/>
         <w:rPr>
+          <w:rFonts w:ascii="Arial" w:hAnsi="Arial" w:cs="Arial"/>
           <w:sz w:val="32"/>
           <w:szCs w:val="32"/>
         </w:rPr>
@@ -269,6 +314,7 @@
     <w:p>
       <w:pPr>
         <w:rPr>
+          <w:rFonts w:ascii="Arial" w:hAnsi="Arial" w:cs="Arial"/>
           <w:sz w:val="32"/>
           <w:szCs w:val="32"/>
         </w:rPr>
@@ -277,6 +323,7 @@
     <w:p>
       <w:pPr>
         <w:rPr>
+          <w:rFonts w:ascii="Arial" w:hAnsi="Arial" w:cs="Arial"/>
           <w:sz w:val="32"/>
           <w:szCs w:val="32"/>
         </w:rPr>
@@ -285,6 +332,7 @@
     <w:p>
       <w:pPr>
         <w:rPr>
+          <w:rFonts w:ascii="Arial" w:hAnsi="Arial" w:cs="Arial"/>
           <w:sz w:val="32"/>
           <w:szCs w:val="32"/>
         </w:rPr>
@@ -293,6 +341,7 @@
     <w:p>
       <w:pPr>
         <w:rPr>
+          <w:rFonts w:ascii="Arial" w:hAnsi="Arial" w:cs="Arial"/>
           <w:sz w:val="32"/>
           <w:szCs w:val="32"/>
         </w:rPr>
@@ -302,26 +351,26 @@
       <w:pPr>
         <w:jc w:val="center"/>
         <w:rPr>
+          <w:rFonts w:ascii="Arial" w:hAnsi="Arial" w:cs="Arial"/>
           <w:b/>
           <w:bCs/>
-          <w:lang w:val="en-US"/>
         </w:rPr>
       </w:pPr>
       <w:proofErr w:type="spellStart"/>
       <w:r>
         <w:rPr>
+          <w:rFonts w:ascii="Arial" w:hAnsi="Arial" w:cs="Arial"/>
           <w:b/>
           <w:bCs/>
-          <w:lang w:val="en-US"/>
         </w:rPr>
         <w:t>Rairon</w:t>
       </w:r>
       <w:proofErr w:type="spellEnd"/>
       <w:r>
         <w:rPr>
+          <w:rFonts w:ascii="Arial" w:hAnsi="Arial" w:cs="Arial"/>
           <w:b/>
           <w:bCs/>
-          <w:lang w:val="en-US"/>
         </w:rPr>
         <w:t xml:space="preserve"> Braga, Victor Gabriel </w:t>
       </w:r>
@@ -330,18 +379,18 @@
       <w:pPr>
         <w:jc w:val="center"/>
         <w:rPr>
-          <w:lang w:val="en-US"/>
-        </w:rPr>
-      </w:pPr>
-      <w:r>
-        <w:rPr>
-          <w:lang w:val="en-US"/>
+          <w:rFonts w:ascii="Arial" w:hAnsi="Arial" w:cs="Arial"/>
+        </w:rPr>
+      </w:pPr>
+      <w:r>
+        <w:rPr>
+          <w:rFonts w:ascii="Arial" w:hAnsi="Arial" w:cs="Arial"/>
         </w:rPr>
         <w:t>Goiânia – 202</w:t>
       </w:r>
       <w:r>
         <w:rPr>
-          <w:lang w:val="en-US"/>
+          <w:rFonts w:ascii="Arial" w:hAnsi="Arial" w:cs="Arial"/>
         </w:rPr>
         <w:t>6</w:t>
       </w:r>
@@ -349,46 +398,1344 @@
     <w:p>
       <w:pPr>
         <w:pStyle w:val="Ttulo1"/>
-      </w:pPr>
-      <w:r>
+        <w:jc w:val="both"/>
+        <w:rPr>
+          <w:rFonts w:ascii="Arial" w:hAnsi="Arial" w:cs="Arial"/>
+        </w:rPr>
+      </w:pPr>
+      <w:r>
+        <w:rPr>
+          <w:rFonts w:ascii="Arial" w:hAnsi="Arial" w:cs="Arial"/>
+        </w:rPr>
         <w:lastRenderedPageBreak/>
-        <w:t>Introdução:</w:t>
+        <w:t>Contextualização</w:t>
+      </w:r>
+      <w:r>
+        <w:rPr>
+          <w:rFonts w:ascii="Arial" w:hAnsi="Arial" w:cs="Arial"/>
+        </w:rPr>
+        <w:t>:</w:t>
       </w:r>
     </w:p>
     <w:p>
       <w:pPr>
         <w:jc w:val="both"/>
-      </w:pPr>
-      <w:r>
+        <w:rPr>
+          <w:rFonts w:ascii="Arial" w:hAnsi="Arial" w:cs="Arial"/>
+        </w:rPr>
+      </w:pPr>
+      <w:r>
+        <w:rPr>
+          <w:rFonts w:ascii="Arial" w:hAnsi="Arial" w:cs="Arial"/>
+        </w:rPr>
         <w:t>A evasão escolar é um dos principais desafios enfrentados pelos sistemas educacionais brasileiros, impactando diretamente o desenvolvimento social e econômico do país. Identificar padrões e fatores associados ao abandono escolar é essencial para a criação de políticas públicas eficazes e estratégias de intervenção que promovam a permanência dos estudantes na escola. Nesse contexto, o uso de tecnologias de Big Data surge como uma ferramenta poderosa para analisar grandes volumes de dados educacionais e extrair insights relevantes de forma escalável e eficiente.</w:t>
       </w:r>
     </w:p>
     <w:p>
       <w:pPr>
         <w:jc w:val="both"/>
-      </w:pPr>
-      <w:r>
+        <w:rPr>
+          <w:rFonts w:ascii="Arial" w:hAnsi="Arial" w:cs="Arial"/>
+        </w:rPr>
+      </w:pPr>
+      <w:r>
+        <w:rPr>
+          <w:rFonts w:ascii="Arial" w:hAnsi="Arial" w:cs="Arial"/>
+        </w:rPr>
         <w:t>Este projeto tem como objetivo identificar “zonas de risco” para evasão escolar, analisando escolas e regiões como municípios e bairros que apresentam taxas de abandono acima da média estadual ou nacional. Além disso, busca-se compreender a relação entre essas taxas e o tipo de dependência administrativa das instituições de ensino, sejam elas estaduais, municipais ou privadas. Essa abordagem permite uma visão mais ampla e detalhada do problema, contribuindo para a identificação de áreas prioritárias para intervenção.</w:t>
       </w:r>
     </w:p>
     <w:p>
       <w:pPr>
         <w:jc w:val="both"/>
-      </w:pPr>
-      <w:r>
+        <w:rPr>
+          <w:rFonts w:ascii="Arial" w:hAnsi="Arial" w:cs="Arial"/>
+        </w:rPr>
+      </w:pPr>
+      <w:r>
+        <w:rPr>
+          <w:rFonts w:ascii="Arial" w:hAnsi="Arial" w:cs="Arial"/>
+        </w:rPr>
         <w:t>Para a realização da análise, será utilizada a base de dados do INEP, processada por meio do framework Apache Spark, que possibilita o tratamento de grandes volumes de dados de forma distribuída e eficiente. A partir disso, serão realizadas agregações por localização geográfica e gerado um ranking de prioridade, com o intuito de apoiar ações estratégicas de órgãos parceiros, como Secretarias Municipais de Educação ou organizações não governamentais voltadas à permanência escolar.</w:t>
       </w:r>
     </w:p>
     <w:p>
       <w:pPr>
         <w:jc w:val="both"/>
-      </w:pPr>
-      <w:r>
+        <w:rPr>
+          <w:rFonts w:ascii="Arial" w:hAnsi="Arial" w:cs="Arial"/>
+        </w:rPr>
+      </w:pPr>
+      <w:r>
+        <w:rPr>
+          <w:rFonts w:ascii="Arial" w:hAnsi="Arial" w:cs="Arial"/>
+        </w:rPr>
         <w:t>Dessa forma, o projeto se caracteriza como uma iniciativa de caráter extensionista, ao propor a aplicação prática de técnicas de análise de dados para a resolução de um problema social relevante, contribuindo para a tomada de decisão baseada em evidências e para a melhoria da qualidade da educação.</w:t>
       </w:r>
     </w:p>
-    <w:p/>
-    <w:p/>
+    <w:p>
+      <w:pPr>
+        <w:jc w:val="both"/>
+        <w:rPr>
+          <w:rFonts w:ascii="Arial" w:hAnsi="Arial" w:cs="Arial"/>
+        </w:rPr>
+      </w:pPr>
+      <w:r>
+        <w:rPr>
+          <w:rFonts w:ascii="Arial" w:hAnsi="Arial" w:cs="Arial"/>
+        </w:rPr>
+        <w:br w:type="page"/>
+      </w:r>
+    </w:p>
+    <w:p>
+      <w:pPr>
+        <w:rPr>
+          <w:rFonts w:ascii="Arial" w:eastAsiaTheme="majorEastAsia" w:hAnsi="Arial" w:cs="Arial"/>
+          <w:color w:val="0F4761" w:themeColor="accent1" w:themeShade="BF"/>
+          <w:sz w:val="40"/>
+          <w:szCs w:val="40"/>
+        </w:rPr>
+      </w:pPr>
+      <w:r>
+        <w:rPr>
+          <w:rFonts w:ascii="Arial" w:eastAsiaTheme="majorEastAsia" w:hAnsi="Arial" w:cs="Arial"/>
+          <w:color w:val="0F4761" w:themeColor="accent1" w:themeShade="BF"/>
+          <w:sz w:val="40"/>
+          <w:szCs w:val="40"/>
+        </w:rPr>
+        <w:lastRenderedPageBreak/>
+        <w:t>Arquitetura em Nuvem e Processamento Paralelo e Distribuído</w:t>
+      </w:r>
+    </w:p>
+    <w:p>
+      <w:pPr>
+        <w:jc w:val="both"/>
+        <w:rPr>
+          <w:rFonts w:ascii="Arial" w:hAnsi="Arial" w:cs="Arial"/>
+        </w:rPr>
+      </w:pPr>
+      <w:r>
+        <w:rPr>
+          <w:rFonts w:ascii="Arial" w:hAnsi="Arial" w:cs="Arial"/>
+        </w:rPr>
+        <w:t>Para solucionar o problema de identificação das "Zonas de Risco" para evasão escolar, a solução foi projetada sob uma arquitetura de computação em nuvem focada em escalabilidade, elasticidade e alto desempenho no processamento de dados. A escolha tecnológica baseou-se na necessidade de tratar um volume considerável de dados governamentais do INEP, exigindo ferramentas capazes de paralelizar operações de limpeza, transformação e agregação.</w:t>
+      </w:r>
+    </w:p>
+    <w:p>
+      <w:pPr>
+        <w:jc w:val="both"/>
+        <w:rPr>
+          <w:rFonts w:ascii="Arial" w:hAnsi="Arial" w:cs="Arial"/>
+        </w:rPr>
+      </w:pPr>
+      <w:r>
+        <w:rPr>
+          <w:rFonts w:ascii="Arial" w:hAnsi="Arial" w:cs="Arial"/>
+        </w:rPr>
+        <w:t xml:space="preserve">Modelo de Serviço em Nuvem A arquitetura adota o modelo PaaS, utilizando o ambiente do </w:t>
+      </w:r>
+      <w:proofErr w:type="spellStart"/>
+      <w:r>
+        <w:rPr>
+          <w:rFonts w:ascii="Arial" w:hAnsi="Arial" w:cs="Arial"/>
+        </w:rPr>
+        <w:t>Databricks</w:t>
+      </w:r>
+      <w:proofErr w:type="spellEnd"/>
+      <w:r>
+        <w:rPr>
+          <w:rFonts w:ascii="Arial" w:hAnsi="Arial" w:cs="Arial"/>
+        </w:rPr>
+        <w:t>. A escolha deste modelo de serviço justifica-se pela abstração da complexidade de infraestrutura. O modelo PaaS permite que a equipe foque integralmente no desenvolvimento da pipeline de dados e na geração de valor analítico, garantindo que o ambiente escale os recursos computacionais conforme a demanda do processamento distribuído.</w:t>
+      </w:r>
+    </w:p>
+    <w:p>
+      <w:pPr>
+        <w:jc w:val="both"/>
+        <w:rPr>
+          <w:rFonts w:ascii="Arial" w:hAnsi="Arial" w:cs="Arial"/>
+        </w:rPr>
+      </w:pPr>
+      <w:r>
+        <w:rPr>
+          <w:rFonts w:ascii="Arial" w:hAnsi="Arial" w:cs="Arial"/>
+        </w:rPr>
+        <w:t xml:space="preserve">Estratégia de Armazenamento de Dados Para o armazenamento, adotou-se o conceito de Data Lake fundamentado no </w:t>
+      </w:r>
+      <w:proofErr w:type="spellStart"/>
+      <w:r>
+        <w:rPr>
+          <w:rFonts w:ascii="Arial" w:hAnsi="Arial" w:cs="Arial"/>
+        </w:rPr>
+        <w:t>Databricks</w:t>
+      </w:r>
+      <w:proofErr w:type="spellEnd"/>
+      <w:r>
+        <w:rPr>
+          <w:rFonts w:ascii="Arial" w:hAnsi="Arial" w:cs="Arial"/>
+        </w:rPr>
+        <w:t xml:space="preserve"> File System</w:t>
+      </w:r>
+      <w:r>
+        <w:rPr>
+          <w:rFonts w:ascii="Arial" w:hAnsi="Arial" w:cs="Arial"/>
+        </w:rPr>
+        <w:t xml:space="preserve"> (DBFS)</w:t>
+      </w:r>
+      <w:r>
+        <w:rPr>
+          <w:rFonts w:ascii="Arial" w:hAnsi="Arial" w:cs="Arial"/>
+        </w:rPr>
+        <w:t xml:space="preserve">, que atua como uma camada de armazenamento em objetos distribuída. O fluxo de armazenamento foi estruturado seguindo a </w:t>
+      </w:r>
+      <w:proofErr w:type="spellStart"/>
+      <w:r>
+        <w:rPr>
+          <w:rFonts w:ascii="Arial" w:hAnsi="Arial" w:cs="Arial"/>
+        </w:rPr>
+        <w:t>Medallion</w:t>
+      </w:r>
+      <w:proofErr w:type="spellEnd"/>
+      <w:r>
+        <w:rPr>
+          <w:rFonts w:ascii="Arial" w:hAnsi="Arial" w:cs="Arial"/>
+        </w:rPr>
+        <w:t xml:space="preserve"> </w:t>
+      </w:r>
+      <w:proofErr w:type="spellStart"/>
+      <w:r>
+        <w:rPr>
+          <w:rFonts w:ascii="Arial" w:hAnsi="Arial" w:cs="Arial"/>
+        </w:rPr>
+        <w:t>Architecture</w:t>
+      </w:r>
+      <w:proofErr w:type="spellEnd"/>
+      <w:r>
+        <w:rPr>
+          <w:rFonts w:ascii="Arial" w:hAnsi="Arial" w:cs="Arial"/>
+        </w:rPr>
+        <w:t>, dividida em:</w:t>
+      </w:r>
+    </w:p>
+    <w:p>
+      <w:pPr>
+        <w:ind w:left="360"/>
+        <w:jc w:val="both"/>
+        <w:rPr>
+          <w:rFonts w:ascii="Arial" w:hAnsi="Arial" w:cs="Arial"/>
+        </w:rPr>
+      </w:pPr>
+      <w:r>
+        <w:rPr>
+          <w:rFonts w:ascii="Arial" w:hAnsi="Arial" w:cs="Arial"/>
+          <w:b/>
+          <w:bCs/>
+        </w:rPr>
+        <w:t>Camada Bronze (Ingestão):</w:t>
+      </w:r>
+      <w:r>
+        <w:rPr>
+          <w:rFonts w:ascii="Arial" w:hAnsi="Arial" w:cs="Arial"/>
+        </w:rPr>
+        <w:t xml:space="preserve"> Armazenamento do arquivo bruto em formato CSV contendo os microdados do INEP.</w:t>
+      </w:r>
+    </w:p>
+    <w:p>
+      <w:pPr>
+        <w:ind w:left="360"/>
+        <w:jc w:val="both"/>
+        <w:rPr>
+          <w:rFonts w:ascii="Arial" w:hAnsi="Arial" w:cs="Arial"/>
+        </w:rPr>
+      </w:pPr>
+      <w:r>
+        <w:rPr>
+          <w:rFonts w:ascii="Arial" w:hAnsi="Arial" w:cs="Arial"/>
+          <w:b/>
+          <w:bCs/>
+        </w:rPr>
+        <w:t>Camada Silver (Transformação):</w:t>
+      </w:r>
+      <w:r>
+        <w:rPr>
+          <w:rFonts w:ascii="Arial" w:hAnsi="Arial" w:cs="Arial"/>
+        </w:rPr>
+        <w:t xml:space="preserve"> Dados limpos, </w:t>
+      </w:r>
+      <w:proofErr w:type="spellStart"/>
+      <w:r>
+        <w:rPr>
+          <w:rFonts w:ascii="Arial" w:hAnsi="Arial" w:cs="Arial"/>
+        </w:rPr>
+        <w:t>tipados</w:t>
+      </w:r>
+      <w:proofErr w:type="spellEnd"/>
+      <w:r>
+        <w:rPr>
+          <w:rFonts w:ascii="Arial" w:hAnsi="Arial" w:cs="Arial"/>
+        </w:rPr>
+        <w:t xml:space="preserve"> corretamente e padronizados</w:t>
+      </w:r>
+      <w:r>
+        <w:rPr>
+          <w:rFonts w:ascii="Arial" w:hAnsi="Arial" w:cs="Arial"/>
+        </w:rPr>
+        <w:t>.</w:t>
+      </w:r>
+    </w:p>
+    <w:p>
+      <w:pPr>
+        <w:ind w:left="360"/>
+        <w:jc w:val="both"/>
+        <w:rPr>
+          <w:rFonts w:ascii="Arial" w:hAnsi="Arial" w:cs="Arial"/>
+        </w:rPr>
+      </w:pPr>
+      <w:r>
+        <w:rPr>
+          <w:rFonts w:ascii="Arial" w:hAnsi="Arial" w:cs="Arial"/>
+          <w:b/>
+          <w:bCs/>
+        </w:rPr>
+        <w:t>Camada Gold (Consumo):</w:t>
+      </w:r>
+      <w:r>
+        <w:rPr>
+          <w:rFonts w:ascii="Arial" w:hAnsi="Arial" w:cs="Arial"/>
+        </w:rPr>
+        <w:t xml:space="preserve"> Tabelas agregadas contendo as métricas de interesse.</w:t>
+      </w:r>
+    </w:p>
+    <w:p>
+      <w:pPr>
+        <w:jc w:val="both"/>
+        <w:rPr>
+          <w:rFonts w:ascii="Arial" w:hAnsi="Arial" w:cs="Arial"/>
+        </w:rPr>
+      </w:pPr>
+      <w:r>
+        <w:rPr>
+          <w:rFonts w:ascii="Arial" w:hAnsi="Arial" w:cs="Arial"/>
+        </w:rPr>
+        <w:t xml:space="preserve">Arquitetura de Processamento Paralelo e Distribuído e Tecnologias Adotadas O motor de processamento central da solução é o Apache Spark, acessado via interface </w:t>
+      </w:r>
+      <w:proofErr w:type="spellStart"/>
+      <w:r>
+        <w:rPr>
+          <w:rFonts w:ascii="Arial" w:hAnsi="Arial" w:cs="Arial"/>
+        </w:rPr>
+        <w:t>PySpark</w:t>
+      </w:r>
+      <w:proofErr w:type="spellEnd"/>
+      <w:r>
+        <w:rPr>
+          <w:rFonts w:ascii="Arial" w:hAnsi="Arial" w:cs="Arial"/>
+        </w:rPr>
+        <w:t>. O Spark foi escolhido por ser um framework de processamento distribuído em memória, altamente otimizado para operações de Big Data.</w:t>
+      </w:r>
+    </w:p>
+    <w:p>
+      <w:pPr>
+        <w:jc w:val="both"/>
+        <w:rPr>
+          <w:rFonts w:ascii="Arial" w:hAnsi="Arial" w:cs="Arial"/>
+        </w:rPr>
+      </w:pPr>
+      <w:r>
+        <w:rPr>
+          <w:rFonts w:ascii="Arial" w:hAnsi="Arial" w:cs="Arial"/>
+        </w:rPr>
+        <w:t>Ao executar as transformações nos dados do INEP, o Spark divide o conjunto de dados em múltiplas partições</w:t>
+      </w:r>
+      <w:r>
+        <w:rPr>
+          <w:rFonts w:ascii="Arial" w:hAnsi="Arial" w:cs="Arial"/>
+        </w:rPr>
+        <w:t xml:space="preserve"> </w:t>
+      </w:r>
+      <w:r>
+        <w:rPr>
+          <w:rFonts w:ascii="Arial" w:hAnsi="Arial" w:cs="Arial"/>
+        </w:rPr>
+        <w:t xml:space="preserve">e distribui a carga de trabalho de computação como filtros, </w:t>
+      </w:r>
+      <w:proofErr w:type="spellStart"/>
+      <w:r>
+        <w:rPr>
+          <w:rFonts w:ascii="Arial" w:hAnsi="Arial" w:cs="Arial"/>
+        </w:rPr>
+        <w:t>groupBy</w:t>
+      </w:r>
+      <w:proofErr w:type="spellEnd"/>
+      <w:r>
+        <w:rPr>
+          <w:rFonts w:ascii="Arial" w:hAnsi="Arial" w:cs="Arial"/>
+        </w:rPr>
+        <w:t xml:space="preserve"> e funções de agregação</w:t>
+      </w:r>
+      <w:r>
+        <w:rPr>
+          <w:rFonts w:ascii="Arial" w:hAnsi="Arial" w:cs="Arial"/>
+        </w:rPr>
+        <w:t xml:space="preserve"> </w:t>
+      </w:r>
+      <w:r>
+        <w:rPr>
+          <w:rFonts w:ascii="Arial" w:hAnsi="Arial" w:cs="Arial"/>
+        </w:rPr>
+        <w:t xml:space="preserve">entre os nós de processamento do cluster. Isso garante que, caso o </w:t>
+      </w:r>
+      <w:proofErr w:type="spellStart"/>
+      <w:r>
+        <w:rPr>
+          <w:rFonts w:ascii="Arial" w:hAnsi="Arial" w:cs="Arial"/>
+        </w:rPr>
+        <w:t>dataset</w:t>
+      </w:r>
+      <w:proofErr w:type="spellEnd"/>
+      <w:r>
+        <w:rPr>
+          <w:rFonts w:ascii="Arial" w:hAnsi="Arial" w:cs="Arial"/>
+        </w:rPr>
+        <w:t xml:space="preserve"> cresça com a inclusão de dados de anos anteriores ou de novos estados, a solução mantenha um tempo de resposta eficiente devido à sua natureza elástica e paralelizada.</w:t>
+      </w:r>
+    </w:p>
+    <w:p>
+      <w:pPr>
+        <w:jc w:val="both"/>
+        <w:rPr>
+          <w:rFonts w:ascii="Arial" w:hAnsi="Arial" w:cs="Arial"/>
+        </w:rPr>
+      </w:pPr>
+    </w:p>
+    <w:p>
+      <w:pPr>
+        <w:jc w:val="both"/>
+        <w:rPr>
+          <w:rFonts w:ascii="Arial" w:hAnsi="Arial" w:cs="Arial"/>
+        </w:rPr>
+      </w:pPr>
+    </w:p>
+    <w:p>
+      <w:pPr>
+        <w:jc w:val="both"/>
+        <w:rPr>
+          <w:rFonts w:ascii="Arial" w:hAnsi="Arial" w:cs="Arial"/>
+        </w:rPr>
+      </w:pPr>
+      <w:r>
+        <w:rPr>
+          <w:rFonts w:ascii="Arial" w:hAnsi="Arial" w:cs="Arial"/>
+        </w:rPr>
+        <w:lastRenderedPageBreak/>
+        <w:t>As principais tecnologias e frameworks utilizados englobam:</w:t>
+      </w:r>
+    </w:p>
+    <w:p>
+      <w:pPr>
+        <w:ind w:left="360"/>
+        <w:jc w:val="both"/>
+        <w:rPr>
+          <w:rFonts w:ascii="Arial" w:hAnsi="Arial" w:cs="Arial"/>
+        </w:rPr>
+      </w:pPr>
+      <w:proofErr w:type="spellStart"/>
+      <w:r>
+        <w:rPr>
+          <w:rFonts w:ascii="Arial" w:hAnsi="Arial" w:cs="Arial"/>
+          <w:b/>
+          <w:bCs/>
+        </w:rPr>
+        <w:t>Databricks</w:t>
+      </w:r>
+      <w:proofErr w:type="spellEnd"/>
+      <w:r>
+        <w:rPr>
+          <w:rFonts w:ascii="Arial" w:hAnsi="Arial" w:cs="Arial"/>
+          <w:b/>
+          <w:bCs/>
+        </w:rPr>
+        <w:t>:</w:t>
+      </w:r>
+      <w:r>
+        <w:rPr>
+          <w:rFonts w:ascii="Arial" w:hAnsi="Arial" w:cs="Arial"/>
+        </w:rPr>
+        <w:t xml:space="preserve"> Orquestração do ambiente em nuvem e plataforma de Data Science.</w:t>
+      </w:r>
+    </w:p>
+    <w:p>
+      <w:pPr>
+        <w:ind w:left="360"/>
+        <w:jc w:val="both"/>
+        <w:rPr>
+          <w:rFonts w:ascii="Arial" w:hAnsi="Arial" w:cs="Arial"/>
+        </w:rPr>
+      </w:pPr>
+      <w:r>
+        <w:rPr>
+          <w:rFonts w:ascii="Arial" w:hAnsi="Arial" w:cs="Arial"/>
+          <w:b/>
+          <w:bCs/>
+        </w:rPr>
+        <w:t>Apache Spark:</w:t>
+      </w:r>
+      <w:r>
+        <w:rPr>
+          <w:rFonts w:ascii="Arial" w:hAnsi="Arial" w:cs="Arial"/>
+        </w:rPr>
+        <w:t xml:space="preserve"> Framework para processamento distribuído em memória.</w:t>
+      </w:r>
+    </w:p>
+    <w:p>
+      <w:pPr>
+        <w:ind w:left="360"/>
+        <w:jc w:val="both"/>
+        <w:rPr>
+          <w:rFonts w:ascii="Arial" w:hAnsi="Arial" w:cs="Arial"/>
+        </w:rPr>
+      </w:pPr>
+      <w:r>
+        <w:rPr>
+          <w:rFonts w:ascii="Arial" w:hAnsi="Arial" w:cs="Arial"/>
+          <w:b/>
+          <w:bCs/>
+        </w:rPr>
+        <w:t>DBFS:</w:t>
+      </w:r>
+      <w:r>
+        <w:rPr>
+          <w:rFonts w:ascii="Arial" w:hAnsi="Arial" w:cs="Arial"/>
+        </w:rPr>
+        <w:t xml:space="preserve"> Sistema de arquivos distribuído para armazenamento tipo Data Lake.</w:t>
+      </w:r>
+    </w:p>
+    <w:p>
+      <w:pPr>
+        <w:ind w:left="360"/>
+        <w:jc w:val="both"/>
+        <w:rPr>
+          <w:rFonts w:ascii="Arial" w:hAnsi="Arial" w:cs="Arial"/>
+        </w:rPr>
+      </w:pPr>
+      <w:proofErr w:type="spellStart"/>
+      <w:r>
+        <w:rPr>
+          <w:rFonts w:ascii="Arial" w:hAnsi="Arial" w:cs="Arial"/>
+          <w:b/>
+          <w:bCs/>
+        </w:rPr>
+        <w:t>Databricks</w:t>
+      </w:r>
+      <w:proofErr w:type="spellEnd"/>
+      <w:r>
+        <w:rPr>
+          <w:rFonts w:ascii="Arial" w:hAnsi="Arial" w:cs="Arial"/>
+          <w:b/>
+          <w:bCs/>
+        </w:rPr>
+        <w:t xml:space="preserve"> Dashboards:</w:t>
+      </w:r>
+      <w:r>
+        <w:rPr>
+          <w:rFonts w:ascii="Arial" w:hAnsi="Arial" w:cs="Arial"/>
+        </w:rPr>
+        <w:t xml:space="preserve"> Ferramenta nativa para a disponibilização das visualizações de dados e geração de relatórios analíticos para a organização parceira.</w:t>
+      </w:r>
+      <w:r>
+        <w:rPr>
+          <w:rFonts w:ascii="Arial" w:hAnsi="Arial" w:cs="Arial"/>
+        </w:rPr>
+        <w:br w:type="page"/>
+      </w:r>
+    </w:p>
+    <w:p>
+      <w:pPr>
+        <w:rPr>
+          <w:rFonts w:ascii="Arial" w:eastAsiaTheme="majorEastAsia" w:hAnsi="Arial" w:cs="Arial"/>
+          <w:color w:val="0F4761" w:themeColor="accent1" w:themeShade="BF"/>
+          <w:sz w:val="40"/>
+          <w:szCs w:val="40"/>
+        </w:rPr>
+      </w:pPr>
+      <w:r>
+        <w:rPr>
+          <w:rFonts w:ascii="Arial" w:eastAsiaTheme="majorEastAsia" w:hAnsi="Arial" w:cs="Arial"/>
+          <w:color w:val="0F4761" w:themeColor="accent1" w:themeShade="BF"/>
+          <w:sz w:val="40"/>
+          <w:szCs w:val="40"/>
+        </w:rPr>
+        <w:lastRenderedPageBreak/>
+        <w:t>Metodologia de Processamento Paralelo e Distribuído</w:t>
+      </w:r>
+    </w:p>
+    <w:p>
+      <w:pPr>
+        <w:jc w:val="both"/>
+        <w:rPr>
+          <w:rFonts w:ascii="Arial" w:hAnsi="Arial" w:cs="Arial"/>
+        </w:rPr>
+      </w:pPr>
+      <w:r>
+        <w:rPr>
+          <w:rFonts w:ascii="Arial" w:hAnsi="Arial" w:cs="Arial"/>
+        </w:rPr>
+        <w:t>Para garantir o processamento eficiente dos microdados do</w:t>
+      </w:r>
+      <w:r>
+        <w:rPr>
+          <w:rFonts w:ascii="Arial" w:hAnsi="Arial" w:cs="Arial"/>
+        </w:rPr>
+        <w:t xml:space="preserve"> </w:t>
+      </w:r>
+      <w:r>
+        <w:rPr>
+          <w:rFonts w:ascii="Arial" w:hAnsi="Arial" w:cs="Arial"/>
+        </w:rPr>
+        <w:t xml:space="preserve">INEP, o projeto adotou o framework Apache Spark via interface </w:t>
+      </w:r>
+      <w:proofErr w:type="spellStart"/>
+      <w:r>
+        <w:rPr>
+          <w:rFonts w:ascii="Arial" w:hAnsi="Arial" w:cs="Arial"/>
+        </w:rPr>
+        <w:t>PySpark</w:t>
+      </w:r>
+      <w:proofErr w:type="spellEnd"/>
+      <w:r>
+        <w:rPr>
+          <w:rFonts w:ascii="Arial" w:hAnsi="Arial" w:cs="Arial"/>
+        </w:rPr>
+        <w:t xml:space="preserve">, executado no ambiente de cluster do </w:t>
+      </w:r>
+      <w:proofErr w:type="spellStart"/>
+      <w:r>
+        <w:rPr>
+          <w:rFonts w:ascii="Arial" w:hAnsi="Arial" w:cs="Arial"/>
+        </w:rPr>
+        <w:t>Databricks</w:t>
+      </w:r>
+      <w:proofErr w:type="spellEnd"/>
+      <w:r>
+        <w:rPr>
+          <w:rFonts w:ascii="Arial" w:hAnsi="Arial" w:cs="Arial"/>
+        </w:rPr>
+        <w:t>. O Spark foi projetado especificamente para lidar com Big Data ao dividir grandes volumes de informações em fragmentos menores e distribuí-los entre múltiplos nós de computação.</w:t>
+      </w:r>
+    </w:p>
+    <w:p>
+      <w:pPr>
+        <w:jc w:val="both"/>
+        <w:rPr>
+          <w:rFonts w:ascii="Arial" w:hAnsi="Arial" w:cs="Arial"/>
+        </w:rPr>
+      </w:pPr>
+      <w:r>
+        <w:rPr>
+          <w:rFonts w:ascii="Arial" w:hAnsi="Arial" w:cs="Arial"/>
+        </w:rPr>
+        <w:t>A metodologia de manipulação dos dados foi dividida em três fases principais, em que o paralelismo atuou de formas distintas:</w:t>
+      </w:r>
+    </w:p>
+    <w:p>
+      <w:pPr>
+        <w:jc w:val="both"/>
+        <w:rPr>
+          <w:rFonts w:ascii="Arial" w:hAnsi="Arial" w:cs="Arial"/>
+        </w:rPr>
+      </w:pPr>
+      <w:r>
+        <w:rPr>
+          <w:rFonts w:ascii="Arial" w:hAnsi="Arial" w:cs="Arial"/>
+          <w:b/>
+          <w:bCs/>
+        </w:rPr>
+        <w:t>1. Ingestão Distribuída de Dados (Leitura Paralela)</w:t>
+      </w:r>
+      <w:r>
+        <w:rPr>
+          <w:rFonts w:ascii="Arial" w:hAnsi="Arial" w:cs="Arial"/>
+          <w:b/>
+          <w:bCs/>
+        </w:rPr>
+        <w:t>:</w:t>
+      </w:r>
+      <w:r>
+        <w:rPr>
+          <w:rFonts w:ascii="Arial" w:hAnsi="Arial" w:cs="Arial"/>
+        </w:rPr>
+        <w:t xml:space="preserve"> A etapa de coleta dos dados consistiu na extração do arquivo bruto em formato CSV armazenado na camada Bronze. Ao invés de carregar o </w:t>
+      </w:r>
+      <w:proofErr w:type="spellStart"/>
+      <w:r>
+        <w:rPr>
+          <w:rFonts w:ascii="Arial" w:hAnsi="Arial" w:cs="Arial"/>
+        </w:rPr>
+        <w:t>dataset</w:t>
+      </w:r>
+      <w:proofErr w:type="spellEnd"/>
+      <w:r>
+        <w:rPr>
+          <w:rFonts w:ascii="Arial" w:hAnsi="Arial" w:cs="Arial"/>
+        </w:rPr>
+        <w:t xml:space="preserve"> completo na memória de uma única máquina, o comando de ingestão acionou os executores do cluster para lerem diferentes blocos do arquivo simultaneamente. O Spark instanciou um </w:t>
+      </w:r>
+      <w:proofErr w:type="spellStart"/>
+      <w:r>
+        <w:rPr>
+          <w:rFonts w:ascii="Arial" w:hAnsi="Arial" w:cs="Arial"/>
+          <w:i/>
+          <w:iCs/>
+        </w:rPr>
+        <w:t>DataFrame</w:t>
+      </w:r>
+      <w:proofErr w:type="spellEnd"/>
+      <w:r>
+        <w:rPr>
+          <w:rFonts w:ascii="Arial" w:hAnsi="Arial" w:cs="Arial"/>
+        </w:rPr>
+        <w:t xml:space="preserve"> distribuído, onde os milhares de registros de escolas brasileiras foram fatiados em partições lógicas. Isso significa que a leitura de disco</w:t>
+      </w:r>
+      <w:r>
+        <w:rPr>
+          <w:rFonts w:ascii="Arial" w:hAnsi="Arial" w:cs="Arial"/>
+        </w:rPr>
+        <w:t xml:space="preserve"> </w:t>
+      </w:r>
+      <w:r>
+        <w:rPr>
+          <w:rFonts w:ascii="Arial" w:hAnsi="Arial" w:cs="Arial"/>
+        </w:rPr>
+        <w:t>ocorreu de forma concorrente, reduzindo drasticamente o tempo de carregamento inicial.</w:t>
+      </w:r>
+    </w:p>
+    <w:p>
+      <w:pPr>
+        <w:jc w:val="both"/>
+        <w:rPr>
+          <w:rFonts w:ascii="Arial" w:hAnsi="Arial" w:cs="Arial"/>
+        </w:rPr>
+      </w:pPr>
+      <w:r>
+        <w:rPr>
+          <w:rFonts w:ascii="Arial" w:hAnsi="Arial" w:cs="Arial"/>
+          <w:b/>
+          <w:bCs/>
+        </w:rPr>
+        <w:t>2. Limpeza e Transformação</w:t>
+      </w:r>
+      <w:r>
+        <w:rPr>
+          <w:rFonts w:ascii="Arial" w:hAnsi="Arial" w:cs="Arial"/>
+          <w:b/>
+          <w:bCs/>
+        </w:rPr>
+        <w:t xml:space="preserve">: </w:t>
+      </w:r>
+      <w:r>
+        <w:rPr>
+          <w:rFonts w:ascii="Arial" w:hAnsi="Arial" w:cs="Arial"/>
+        </w:rPr>
+        <w:t xml:space="preserve">Uma vez que os dados estavam distribuídos em memória na camada Silver, iniciou-se a etapa de limpeza e tratamento para sanar inconsistências estruturais, como a tipagem incorreta das taxas de evasão e caracteres especiais nos nomes das colunas. Nesta etapa, aplicou-se um conceito fundamental do Spark conhecido como </w:t>
+      </w:r>
+      <w:proofErr w:type="spellStart"/>
+      <w:r>
+        <w:rPr>
+          <w:rFonts w:ascii="Arial" w:hAnsi="Arial" w:cs="Arial"/>
+          <w:i/>
+          <w:iCs/>
+        </w:rPr>
+        <w:t>Narrow</w:t>
+      </w:r>
+      <w:proofErr w:type="spellEnd"/>
+      <w:r>
+        <w:rPr>
+          <w:rFonts w:ascii="Arial" w:hAnsi="Arial" w:cs="Arial"/>
+          <w:i/>
+          <w:iCs/>
+        </w:rPr>
+        <w:t xml:space="preserve"> </w:t>
+      </w:r>
+      <w:proofErr w:type="spellStart"/>
+      <w:r>
+        <w:rPr>
+          <w:rFonts w:ascii="Arial" w:hAnsi="Arial" w:cs="Arial"/>
+          <w:i/>
+          <w:iCs/>
+        </w:rPr>
+        <w:t>Transformations</w:t>
+      </w:r>
+      <w:proofErr w:type="spellEnd"/>
+      <w:r>
+        <w:rPr>
+          <w:rFonts w:ascii="Arial" w:hAnsi="Arial" w:cs="Arial"/>
+        </w:rPr>
+        <w:t xml:space="preserve">. Funções como </w:t>
+      </w:r>
+      <w:proofErr w:type="spellStart"/>
+      <w:r>
+        <w:rPr>
+          <w:rFonts w:ascii="Arial" w:hAnsi="Arial" w:cs="Arial"/>
+        </w:rPr>
+        <w:t>withColumnRenamed</w:t>
+      </w:r>
+      <w:proofErr w:type="spellEnd"/>
+      <w:r>
+        <w:rPr>
+          <w:rFonts w:ascii="Arial" w:hAnsi="Arial" w:cs="Arial"/>
+        </w:rPr>
+        <w:t xml:space="preserve">, </w:t>
+      </w:r>
+      <w:proofErr w:type="spellStart"/>
+      <w:r>
+        <w:rPr>
+          <w:rFonts w:ascii="Arial" w:hAnsi="Arial" w:cs="Arial"/>
+        </w:rPr>
+        <w:t>regexp_replace</w:t>
+      </w:r>
+      <w:proofErr w:type="spellEnd"/>
+      <w:r>
+        <w:rPr>
+          <w:rFonts w:ascii="Arial" w:hAnsi="Arial" w:cs="Arial"/>
+        </w:rPr>
+        <w:t xml:space="preserve"> e </w:t>
+      </w:r>
+      <w:proofErr w:type="spellStart"/>
+      <w:r>
+        <w:rPr>
+          <w:rFonts w:ascii="Arial" w:hAnsi="Arial" w:cs="Arial"/>
+        </w:rPr>
+        <w:t>cast</w:t>
+      </w:r>
+      <w:proofErr w:type="spellEnd"/>
+      <w:r>
+        <w:rPr>
+          <w:rFonts w:ascii="Arial" w:hAnsi="Arial" w:cs="Arial"/>
+        </w:rPr>
+        <w:t xml:space="preserve"> </w:t>
+      </w:r>
+      <w:r>
+        <w:rPr>
+          <w:rFonts w:ascii="Arial" w:hAnsi="Arial" w:cs="Arial"/>
+        </w:rPr>
+        <w:t>foram executadas de forma totalmente independente em cada nó do cluster. Como um registro de uma escola não precisa "conhecer" o registro da outra para ter sua vírgula substituída por um ponto, não houve necessidade de tráfego de dados pela rede entre as máquinas. Cada executor tratou exclusivamente a sua partição de dados em paralelo, garantindo máxima eficiência computacional.</w:t>
+      </w:r>
+    </w:p>
+    <w:p>
+      <w:pPr>
+        <w:jc w:val="both"/>
+        <w:rPr>
+          <w:rFonts w:ascii="Arial" w:hAnsi="Arial" w:cs="Arial"/>
+        </w:rPr>
+      </w:pPr>
+      <w:r>
+        <w:rPr>
+          <w:rFonts w:ascii="Arial" w:hAnsi="Arial" w:cs="Arial"/>
+          <w:b/>
+          <w:bCs/>
+        </w:rPr>
+        <w:t>3. Agrupamento e Geração de Indicadores</w:t>
+      </w:r>
+      <w:r>
+        <w:rPr>
+          <w:rFonts w:ascii="Arial" w:hAnsi="Arial" w:cs="Arial"/>
+          <w:b/>
+          <w:bCs/>
+        </w:rPr>
+        <w:t xml:space="preserve">: </w:t>
+      </w:r>
+      <w:r>
+        <w:rPr>
+          <w:rFonts w:ascii="Arial" w:hAnsi="Arial" w:cs="Arial"/>
+        </w:rPr>
+        <w:t xml:space="preserve">A fase final consistiu em agregar os dados limpos camada Gold para encontrar as "Zonas de Risco", calculando a média de evasão por Município, Estado e Dependência Administrativa. Diferente da etapa de limpeza, as operações de agregação exigem o que se chama de </w:t>
+      </w:r>
+      <w:proofErr w:type="spellStart"/>
+      <w:r>
+        <w:rPr>
+          <w:rFonts w:ascii="Arial" w:hAnsi="Arial" w:cs="Arial"/>
+          <w:i/>
+          <w:iCs/>
+        </w:rPr>
+        <w:t>Wide</w:t>
+      </w:r>
+      <w:proofErr w:type="spellEnd"/>
+      <w:r>
+        <w:rPr>
+          <w:rFonts w:ascii="Arial" w:hAnsi="Arial" w:cs="Arial"/>
+          <w:i/>
+          <w:iCs/>
+        </w:rPr>
+        <w:t xml:space="preserve"> </w:t>
+      </w:r>
+      <w:proofErr w:type="spellStart"/>
+      <w:r>
+        <w:rPr>
+          <w:rFonts w:ascii="Arial" w:hAnsi="Arial" w:cs="Arial"/>
+          <w:i/>
+          <w:iCs/>
+        </w:rPr>
+        <w:t>Transformations</w:t>
+      </w:r>
+      <w:proofErr w:type="spellEnd"/>
+      <w:r>
+        <w:rPr>
+          <w:rFonts w:ascii="Arial" w:hAnsi="Arial" w:cs="Arial"/>
+        </w:rPr>
+        <w:t xml:space="preserve">. Para calcular a média correta de evasão de um município específico, o Spark precisou realizar uma operação de </w:t>
+      </w:r>
+      <w:proofErr w:type="spellStart"/>
+      <w:r>
+        <w:rPr>
+          <w:rFonts w:ascii="Arial" w:hAnsi="Arial" w:cs="Arial"/>
+          <w:i/>
+          <w:iCs/>
+        </w:rPr>
+        <w:t>Shuffle</w:t>
+      </w:r>
+      <w:proofErr w:type="spellEnd"/>
+      <w:r>
+        <w:rPr>
+          <w:rFonts w:ascii="Arial" w:hAnsi="Arial" w:cs="Arial"/>
+        </w:rPr>
+        <w:t>. O framework redistribuiu fisicamente os dados pela rede do cluster, agrupando todos os registros pertencentes à mesma "chave"</w:t>
+      </w:r>
+      <w:r>
+        <w:rPr>
+          <w:rFonts w:ascii="Arial" w:hAnsi="Arial" w:cs="Arial"/>
+        </w:rPr>
+        <w:t xml:space="preserve"> </w:t>
+      </w:r>
+      <w:r>
+        <w:rPr>
+          <w:rFonts w:ascii="Arial" w:hAnsi="Arial" w:cs="Arial"/>
+        </w:rPr>
+        <w:t>no mesmo nó de processamento. Após o agrupamento paralelo, as funções de agregação matemática e ordenação foram aplicadas concorrentemente em cada grupo, gerando os indicadores consolidados que alimentaram o Dashboard final.</w:t>
+      </w:r>
+    </w:p>
+    <w:p>
+      <w:pPr>
+        <w:jc w:val="both"/>
+        <w:rPr>
+          <w:rFonts w:ascii="Arial" w:hAnsi="Arial" w:cs="Arial"/>
+        </w:rPr>
+      </w:pPr>
+    </w:p>
+    <w:p>
+      <w:pPr>
+        <w:jc w:val="both"/>
+        <w:rPr>
+          <w:rFonts w:ascii="Arial" w:hAnsi="Arial" w:cs="Arial"/>
+        </w:rPr>
+      </w:pPr>
+      <w:r>
+        <w:rPr>
+          <w:rFonts w:ascii="Arial" w:hAnsi="Arial" w:cs="Arial"/>
+          <w:noProof/>
+        </w:rPr>
+        <w:drawing>
+          <wp:inline distT="0" distB="0" distL="0" distR="0" wp14:anchorId="41F41CC1" wp14:editId="4CFFE4EA">
+            <wp:extent cx="5400040" cy="2945765"/>
+            <wp:effectExtent l="0" t="0" r="0" b="6985"/>
+            <wp:docPr id="1793667545" name="Imagem 4"/>
+            <wp:cNvGraphicFramePr>
+              <a:graphicFrameLocks xmlns:a="http://schemas.openxmlformats.org/drawingml/2006/main" noChangeAspect="1"/>
+            </wp:cNvGraphicFramePr>
+            <a:graphic xmlns:a="http://schemas.openxmlformats.org/drawingml/2006/main">
+              <a:graphicData uri="http://schemas.openxmlformats.org/drawingml/2006/picture">
+                <pic:pic xmlns:pic="http://schemas.openxmlformats.org/drawingml/2006/picture">
+                  <pic:nvPicPr>
+                    <pic:cNvPr id="0" name="Picture 7"/>
+                    <pic:cNvPicPr>
+                      <a:picLocks noChangeAspect="1" noChangeArrowheads="1"/>
+                    </pic:cNvPicPr>
+                  </pic:nvPicPr>
+                  <pic:blipFill>
+                    <a:blip r:embed="rId7" cstate="print">
+                      <a:extLst>
+                        <a:ext uri="{28A0092B-C50C-407E-A947-70E740481C1C}">
+                          <a14:useLocalDpi xmlns:a14="http://schemas.microsoft.com/office/drawing/2010/main" val="0"/>
+                        </a:ext>
+                      </a:extLst>
+                    </a:blip>
+                    <a:srcRect/>
+                    <a:stretch>
+                      <a:fillRect/>
+                    </a:stretch>
+                  </pic:blipFill>
+                  <pic:spPr bwMode="auto">
+                    <a:xfrm>
+                      <a:off x="0" y="0"/>
+                      <a:ext cx="5400040" cy="2945765"/>
+                    </a:xfrm>
+                    <a:prstGeom prst="rect">
+                      <a:avLst/>
+                    </a:prstGeom>
+                    <a:noFill/>
+                    <a:ln>
+                      <a:noFill/>
+                    </a:ln>
+                  </pic:spPr>
+                </pic:pic>
+              </a:graphicData>
+            </a:graphic>
+          </wp:inline>
+        </w:drawing>
+      </w:r>
+    </w:p>
+    <w:p>
+      <w:pPr>
+        <w:jc w:val="both"/>
+        <w:rPr>
+          <w:rFonts w:ascii="Arial" w:hAnsi="Arial" w:cs="Arial"/>
+        </w:rPr>
+      </w:pPr>
+      <w:r>
+        <w:rPr>
+          <w:rFonts w:ascii="Arial" w:hAnsi="Arial" w:cs="Arial"/>
+        </w:rPr>
+        <w:t xml:space="preserve">A figura acima ilustra o diagrama consolidado da solução, evidenciando o fluxo da pipeline de dados desde a origem até a entrega do valor analítico. O processo é estruturado em quatro </w:t>
+      </w:r>
+      <w:proofErr w:type="spellStart"/>
+      <w:r>
+        <w:rPr>
+          <w:rFonts w:ascii="Arial" w:hAnsi="Arial" w:cs="Arial"/>
+        </w:rPr>
+        <w:t>macroetapas</w:t>
+      </w:r>
+      <w:proofErr w:type="spellEnd"/>
+      <w:r>
+        <w:rPr>
+          <w:rFonts w:ascii="Arial" w:hAnsi="Arial" w:cs="Arial"/>
+        </w:rPr>
+        <w:t xml:space="preserve"> contínuas:</w:t>
+      </w:r>
+    </w:p>
+    <w:p>
+      <w:pPr>
+        <w:ind w:left="360"/>
+        <w:jc w:val="both"/>
+        <w:rPr>
+          <w:rFonts w:ascii="Arial" w:hAnsi="Arial" w:cs="Arial"/>
+        </w:rPr>
+      </w:pPr>
+      <w:r>
+        <w:rPr>
+          <w:rFonts w:ascii="Arial" w:hAnsi="Arial" w:cs="Arial"/>
+          <w:b/>
+          <w:bCs/>
+        </w:rPr>
+        <w:t>Dados (Input):</w:t>
+      </w:r>
+      <w:r>
+        <w:rPr>
+          <w:rFonts w:ascii="Arial" w:hAnsi="Arial" w:cs="Arial"/>
+        </w:rPr>
+        <w:t xml:space="preserve"> Representa a fonte original das informações, consistindo nos microdados do Censo Escolar 2024 fornecidos pelo INEP (arquivo tx_rend_escolas_2024.csv).</w:t>
+      </w:r>
+    </w:p>
+    <w:p>
+      <w:pPr>
+        <w:ind w:left="360"/>
+        <w:jc w:val="both"/>
+        <w:rPr>
+          <w:rFonts w:ascii="Arial" w:hAnsi="Arial" w:cs="Arial"/>
+        </w:rPr>
+      </w:pPr>
+      <w:r>
+        <w:rPr>
+          <w:rFonts w:ascii="Arial" w:hAnsi="Arial" w:cs="Arial"/>
+          <w:b/>
+          <w:bCs/>
+        </w:rPr>
+        <w:t>Armazenamento:</w:t>
+      </w:r>
+      <w:r>
+        <w:rPr>
+          <w:rFonts w:ascii="Arial" w:hAnsi="Arial" w:cs="Arial"/>
+        </w:rPr>
+        <w:t xml:space="preserve"> Demonstra a etapa de ingestão em lote, onde os dados brutos são carregados para o </w:t>
+      </w:r>
+      <w:proofErr w:type="spellStart"/>
+      <w:r>
+        <w:rPr>
+          <w:rFonts w:ascii="Arial" w:hAnsi="Arial" w:cs="Arial"/>
+        </w:rPr>
+        <w:t>Databricks</w:t>
+      </w:r>
+      <w:proofErr w:type="spellEnd"/>
+      <w:r>
+        <w:rPr>
+          <w:rFonts w:ascii="Arial" w:hAnsi="Arial" w:cs="Arial"/>
+        </w:rPr>
+        <w:t xml:space="preserve"> File System. A estrutura obedece à Arquitetura Medalhão, transitando os dados da camada Bronze dados brutos originais para a camada Silver</w:t>
+      </w:r>
+      <w:r>
+        <w:rPr>
+          <w:rFonts w:ascii="Arial" w:hAnsi="Arial" w:cs="Arial"/>
+        </w:rPr>
+        <w:t xml:space="preserve"> </w:t>
+      </w:r>
+      <w:r>
+        <w:rPr>
+          <w:rFonts w:ascii="Arial" w:hAnsi="Arial" w:cs="Arial"/>
+        </w:rPr>
+        <w:t>dados limpos e padronizados.</w:t>
+      </w:r>
+    </w:p>
+    <w:p>
+      <w:pPr>
+        <w:ind w:left="360"/>
+        <w:jc w:val="both"/>
+        <w:rPr>
+          <w:rFonts w:ascii="Arial" w:hAnsi="Arial" w:cs="Arial"/>
+        </w:rPr>
+      </w:pPr>
+      <w:r>
+        <w:rPr>
+          <w:rFonts w:ascii="Arial" w:hAnsi="Arial" w:cs="Arial"/>
+          <w:b/>
+          <w:bCs/>
+        </w:rPr>
+        <w:t>Processamento:</w:t>
+      </w:r>
+      <w:r>
+        <w:rPr>
+          <w:rFonts w:ascii="Arial" w:hAnsi="Arial" w:cs="Arial"/>
+        </w:rPr>
+        <w:t xml:space="preserve"> Ilustra o núcleo computacional do projeto. O </w:t>
+      </w:r>
+      <w:r>
+        <w:rPr>
+          <w:rFonts w:ascii="Arial" w:hAnsi="Arial" w:cs="Arial"/>
+          <w:i/>
+          <w:iCs/>
+        </w:rPr>
+        <w:t>framework</w:t>
+      </w:r>
+      <w:r>
+        <w:rPr>
+          <w:rFonts w:ascii="Arial" w:hAnsi="Arial" w:cs="Arial"/>
+        </w:rPr>
+        <w:t xml:space="preserve"> </w:t>
+      </w:r>
+      <w:proofErr w:type="spellStart"/>
+      <w:r>
+        <w:rPr>
+          <w:rFonts w:ascii="Arial" w:hAnsi="Arial" w:cs="Arial"/>
+        </w:rPr>
+        <w:t>PySpark</w:t>
+      </w:r>
+      <w:proofErr w:type="spellEnd"/>
+      <w:r>
+        <w:rPr>
+          <w:rFonts w:ascii="Arial" w:hAnsi="Arial" w:cs="Arial"/>
+        </w:rPr>
+        <w:t xml:space="preserve"> realiza a leitura distribuída e aplica o processamento paralelo para executar as rotinas de limpeza, transformação de tipos de dados (como o </w:t>
+      </w:r>
+      <w:proofErr w:type="spellStart"/>
+      <w:r>
+        <w:rPr>
+          <w:rFonts w:ascii="Arial" w:hAnsi="Arial" w:cs="Arial"/>
+          <w:i/>
+          <w:iCs/>
+        </w:rPr>
+        <w:t>cast</w:t>
+      </w:r>
+      <w:proofErr w:type="spellEnd"/>
+      <w:r>
+        <w:rPr>
+          <w:rFonts w:ascii="Arial" w:hAnsi="Arial" w:cs="Arial"/>
+        </w:rPr>
+        <w:t xml:space="preserve"> para numérico) e as agregações complexas (agrupamentos por município e rede de ensino).</w:t>
+      </w:r>
+    </w:p>
+    <w:p>
+      <w:pPr>
+        <w:ind w:left="360"/>
+        <w:jc w:val="both"/>
+        <w:rPr>
+          <w:rFonts w:ascii="Arial" w:hAnsi="Arial" w:cs="Arial"/>
+        </w:rPr>
+      </w:pPr>
+      <w:r>
+        <w:rPr>
+          <w:rFonts w:ascii="Arial" w:hAnsi="Arial" w:cs="Arial"/>
+          <w:b/>
+          <w:bCs/>
+        </w:rPr>
+        <w:t>Resultado</w:t>
+      </w:r>
+      <w:r>
+        <w:rPr>
+          <w:rFonts w:ascii="Arial" w:hAnsi="Arial" w:cs="Arial"/>
+          <w:b/>
+          <w:bCs/>
+        </w:rPr>
+        <w:t xml:space="preserve">: </w:t>
+      </w:r>
+      <w:r>
+        <w:rPr>
+          <w:rFonts w:ascii="Arial" w:hAnsi="Arial" w:cs="Arial"/>
+        </w:rPr>
+        <w:t xml:space="preserve">Exibe a ponta final de consumo do projeto. Os dados consolidados são transformados em indicadores visuais e mapas interativos através da ferramenta </w:t>
+      </w:r>
+      <w:proofErr w:type="spellStart"/>
+      <w:r>
+        <w:rPr>
+          <w:rFonts w:ascii="Arial" w:hAnsi="Arial" w:cs="Arial"/>
+        </w:rPr>
+        <w:t>Databricks</w:t>
+      </w:r>
+      <w:proofErr w:type="spellEnd"/>
+      <w:r>
+        <w:rPr>
+          <w:rFonts w:ascii="Arial" w:hAnsi="Arial" w:cs="Arial"/>
+        </w:rPr>
+        <w:t xml:space="preserve"> Dashboards, traduzindo o volume complexo de Big Data em </w:t>
+      </w:r>
+      <w:r>
+        <w:rPr>
+          <w:rFonts w:ascii="Arial" w:hAnsi="Arial" w:cs="Arial"/>
+          <w:i/>
+          <w:iCs/>
+        </w:rPr>
+        <w:t>insights</w:t>
+      </w:r>
+      <w:r>
+        <w:rPr>
+          <w:rFonts w:ascii="Arial" w:hAnsi="Arial" w:cs="Arial"/>
+        </w:rPr>
+        <w:t xml:space="preserve"> acionáveis e acessíveis para a tomada de decisão da organização parceira.</w:t>
+      </w:r>
+    </w:p>
+    <w:p>
+      <w:pPr>
+        <w:jc w:val="both"/>
+        <w:rPr>
+          <w:rFonts w:ascii="Arial" w:hAnsi="Arial" w:cs="Arial"/>
+        </w:rPr>
+      </w:pPr>
+      <w:r>
+        <w:rPr>
+          <w:rFonts w:ascii="Arial" w:hAnsi="Arial" w:cs="Arial"/>
+        </w:rPr>
+        <w:br w:type="page"/>
+      </w:r>
+    </w:p>
+    <w:p>
+      <w:pPr>
+        <w:pStyle w:val="Ttulo1"/>
+        <w:rPr>
+          <w:rFonts w:ascii="Arial" w:hAnsi="Arial" w:cs="Arial"/>
+        </w:rPr>
+      </w:pPr>
+      <w:r>
+        <w:rPr>
+          <w:rFonts w:ascii="Arial" w:hAnsi="Arial" w:cs="Arial"/>
+        </w:rPr>
+        <w:lastRenderedPageBreak/>
+        <w:t>Resultados e Limitações</w:t>
+      </w:r>
+    </w:p>
+    <w:p>
+      <w:pPr>
+        <w:rPr>
+          <w:rFonts w:ascii="Arial" w:hAnsi="Arial" w:cs="Arial"/>
+        </w:rPr>
+      </w:pPr>
+    </w:p>
+    <w:p>
+      <w:pPr>
+        <w:rPr>
+          <w:rFonts w:ascii="Arial" w:hAnsi="Arial" w:cs="Arial"/>
+        </w:rPr>
+      </w:pPr>
+    </w:p>
+    <w:p>
+      <w:pPr>
+        <w:rPr>
+          <w:rFonts w:ascii="Arial" w:hAnsi="Arial" w:cs="Arial"/>
+        </w:rPr>
+      </w:pPr>
+      <w:r>
+        <w:rPr>
+          <w:rFonts w:ascii="Arial" w:hAnsi="Arial" w:cs="Arial"/>
+        </w:rPr>
+        <w:br w:type="page"/>
+      </w:r>
+    </w:p>
+    <w:p>
+      <w:pPr>
+        <w:pStyle w:val="Ttulo1"/>
+        <w:rPr>
+          <w:rFonts w:ascii="Arial" w:hAnsi="Arial" w:cs="Arial"/>
+        </w:rPr>
+      </w:pPr>
+      <w:r>
+        <w:rPr>
+          <w:rFonts w:ascii="Arial" w:hAnsi="Arial" w:cs="Arial"/>
+        </w:rPr>
+        <w:lastRenderedPageBreak/>
+        <w:t>Conclusão</w:t>
+      </w:r>
+    </w:p>
+    <w:p>
+      <w:pPr>
+        <w:jc w:val="both"/>
+        <w:rPr>
+          <w:rFonts w:ascii="Arial" w:hAnsi="Arial" w:cs="Arial"/>
+        </w:rPr>
+      </w:pPr>
+      <w:r>
+        <w:rPr>
+          <w:rFonts w:ascii="Arial" w:hAnsi="Arial" w:cs="Arial"/>
+        </w:rPr>
+        <w:t>O presente projeto cumpriu com êxito o objetivo de desenvolver uma solução computacional baseada em Big Data para mitigar o problema da evasão escolar. Através da orquestração de infraestrutura em nuvem e do uso de processamento paralelo, foi possível ingerir, limpar e processar eficientemente os microdados do Censo Escolar do INEP.</w:t>
+      </w:r>
+    </w:p>
+    <w:p>
+      <w:pPr>
+        <w:jc w:val="both"/>
+        <w:rPr>
+          <w:rFonts w:ascii="Arial" w:hAnsi="Arial" w:cs="Arial"/>
+        </w:rPr>
+      </w:pPr>
+      <w:r>
+        <w:rPr>
+          <w:rFonts w:ascii="Arial" w:hAnsi="Arial" w:cs="Arial"/>
+        </w:rPr>
+        <w:t xml:space="preserve">O principal resultado obtido foi a consolidação desses dados em </w:t>
+      </w:r>
+      <w:r>
+        <w:rPr>
+          <w:rFonts w:ascii="Arial" w:hAnsi="Arial" w:cs="Arial"/>
+          <w:i/>
+          <w:iCs/>
+        </w:rPr>
+        <w:t>dashboards</w:t>
+      </w:r>
+      <w:r>
+        <w:rPr>
+          <w:rFonts w:ascii="Arial" w:hAnsi="Arial" w:cs="Arial"/>
+        </w:rPr>
+        <w:t xml:space="preserve"> interativos, que mapeiam as "zonas de risco" em nível municipal, comparam o impacto geográfico e identificam gargalos por dependência administrativa. O benefício direto gerado para a organização parceira é a transição de um cenário de baixa capacidade analítica para uma gestão orientada a dados. A solução permite que gestores educacionais, ONGs ou entidades governamentais identifiquem rapidamente os focos de crise e direcionem recursos, campanhas e políticas públicas de forma cirúrgica para as escolas e cidades que mais necessitam de intervenção.</w:t>
+      </w:r>
+    </w:p>
+    <w:p>
+      <w:pPr>
+        <w:jc w:val="both"/>
+        <w:rPr>
+          <w:rFonts w:ascii="Arial" w:hAnsi="Arial" w:cs="Arial"/>
+        </w:rPr>
+      </w:pPr>
+      <w:r>
+        <w:rPr>
+          <w:rFonts w:ascii="Arial" w:hAnsi="Arial" w:cs="Arial"/>
+        </w:rPr>
+        <w:t>Apesar da robustez da arquitetura, a solução atual apresenta algumas limitações estruturais e analíticas. Primeiramente, a análise baseia-se nos dados consolidados de um único ano letivo, o que restringe a observação de tendências históricas de agravamento ou melhora na retenção escolar. Além disso, por utilizar métricas agregadas a nível de escola e município, a pipeline atual não cruza os índices de abandono com indicadores socioeconômicos ou de infraestrutura urbana, que são fatores externos fundamentais para compreender a raiz do problema da evasão.</w:t>
+      </w:r>
+    </w:p>
     <w:p/>
     <w:sectPr>
       <w:pgSz w:w="11906" w:h="16838"/>
@@ -1261,6 +2608,155 @@
     </w:lvl>
   </w:abstractNum>
   <w:abstractNum w:abstractNumId="6" w15:restartNumberingAfterBreak="0">
+    <w:nsid w:val="2B3C5B02"/>
+    <w:multiLevelType w:val="multilevel"/>
+    <w:tmpl w:val="4086DC4A"/>
+    <w:lvl w:ilvl="0">
+      <w:start w:val="1"/>
+      <w:numFmt w:val="bullet"/>
+      <w:lvlText w:val=""/>
+      <w:lvlJc w:val="left"/>
+      <w:pPr>
+        <w:tabs>
+          <w:tab w:val="num" w:pos="720"/>
+        </w:tabs>
+        <w:ind w:left="720" w:hanging="360"/>
+      </w:pPr>
+      <w:rPr>
+        <w:rFonts w:ascii="Symbol" w:hAnsi="Symbol" w:hint="default"/>
+        <w:sz w:val="20"/>
+      </w:rPr>
+    </w:lvl>
+    <w:lvl w:ilvl="1" w:tentative="1">
+      <w:start w:val="1"/>
+      <w:numFmt w:val="bullet"/>
+      <w:lvlText w:val="o"/>
+      <w:lvlJc w:val="left"/>
+      <w:pPr>
+        <w:tabs>
+          <w:tab w:val="num" w:pos="1440"/>
+        </w:tabs>
+        <w:ind w:left="1440" w:hanging="360"/>
+      </w:pPr>
+      <w:rPr>
+        <w:rFonts w:ascii="Courier New" w:hAnsi="Courier New" w:hint="default"/>
+        <w:sz w:val="20"/>
+      </w:rPr>
+    </w:lvl>
+    <w:lvl w:ilvl="2" w:tentative="1">
+      <w:start w:val="1"/>
+      <w:numFmt w:val="bullet"/>
+      <w:lvlText w:val=""/>
+      <w:lvlJc w:val="left"/>
+      <w:pPr>
+        <w:tabs>
+          <w:tab w:val="num" w:pos="2160"/>
+        </w:tabs>
+        <w:ind w:left="2160" w:hanging="360"/>
+      </w:pPr>
+      <w:rPr>
+        <w:rFonts w:ascii="Wingdings" w:hAnsi="Wingdings" w:hint="default"/>
+        <w:sz w:val="20"/>
+      </w:rPr>
+    </w:lvl>
+    <w:lvl w:ilvl="3" w:tentative="1">
+      <w:start w:val="1"/>
+      <w:numFmt w:val="bullet"/>
+      <w:lvlText w:val=""/>
+      <w:lvlJc w:val="left"/>
+      <w:pPr>
+        <w:tabs>
+          <w:tab w:val="num" w:pos="2880"/>
+        </w:tabs>
+        <w:ind w:left="2880" w:hanging="360"/>
+      </w:pPr>
+      <w:rPr>
+        <w:rFonts w:ascii="Wingdings" w:hAnsi="Wingdings" w:hint="default"/>
+        <w:sz w:val="20"/>
+      </w:rPr>
+    </w:lvl>
+    <w:lvl w:ilvl="4" w:tentative="1">
+      <w:start w:val="1"/>
+      <w:numFmt w:val="bullet"/>
+      <w:lvlText w:val=""/>
+      <w:lvlJc w:val="left"/>
+      <w:pPr>
+        <w:tabs>
+          <w:tab w:val="num" w:pos="3600"/>
+        </w:tabs>
+        <w:ind w:left="3600" w:hanging="360"/>
+      </w:pPr>
+      <w:rPr>
+        <w:rFonts w:ascii="Wingdings" w:hAnsi="Wingdings" w:hint="default"/>
+        <w:sz w:val="20"/>
+      </w:rPr>
+    </w:lvl>
+    <w:lvl w:ilvl="5" w:tentative="1">
+      <w:start w:val="1"/>
+      <w:numFmt w:val="bullet"/>
+      <w:lvlText w:val=""/>
+      <w:lvlJc w:val="left"/>
+      <w:pPr>
+        <w:tabs>
+          <w:tab w:val="num" w:pos="4320"/>
+        </w:tabs>
+        <w:ind w:left="4320" w:hanging="360"/>
+      </w:pPr>
+      <w:rPr>
+        <w:rFonts w:ascii="Wingdings" w:hAnsi="Wingdings" w:hint="default"/>
+        <w:sz w:val="20"/>
+      </w:rPr>
+    </w:lvl>
+    <w:lvl w:ilvl="6" w:tentative="1">
+      <w:start w:val="1"/>
+      <w:numFmt w:val="bullet"/>
+      <w:lvlText w:val=""/>
+      <w:lvlJc w:val="left"/>
+      <w:pPr>
+        <w:tabs>
+          <w:tab w:val="num" w:pos="5040"/>
+        </w:tabs>
+        <w:ind w:left="5040" w:hanging="360"/>
+      </w:pPr>
+      <w:rPr>
+        <w:rFonts w:ascii="Wingdings" w:hAnsi="Wingdings" w:hint="default"/>
+        <w:sz w:val="20"/>
+      </w:rPr>
+    </w:lvl>
+    <w:lvl w:ilvl="7" w:tentative="1">
+      <w:start w:val="1"/>
+      <w:numFmt w:val="bullet"/>
+      <w:lvlText w:val=""/>
+      <w:lvlJc w:val="left"/>
+      <w:pPr>
+        <w:tabs>
+          <w:tab w:val="num" w:pos="5760"/>
+        </w:tabs>
+        <w:ind w:left="5760" w:hanging="360"/>
+      </w:pPr>
+      <w:rPr>
+        <w:rFonts w:ascii="Wingdings" w:hAnsi="Wingdings" w:hint="default"/>
+        <w:sz w:val="20"/>
+      </w:rPr>
+    </w:lvl>
+    <w:lvl w:ilvl="8" w:tentative="1">
+      <w:start w:val="1"/>
+      <w:numFmt w:val="bullet"/>
+      <w:lvlText w:val=""/>
+      <w:lvlJc w:val="left"/>
+      <w:pPr>
+        <w:tabs>
+          <w:tab w:val="num" w:pos="6480"/>
+        </w:tabs>
+        <w:ind w:left="6480" w:hanging="360"/>
+      </w:pPr>
+      <w:rPr>
+        <w:rFonts w:ascii="Wingdings" w:hAnsi="Wingdings" w:hint="default"/>
+        <w:sz w:val="20"/>
+      </w:rPr>
+    </w:lvl>
+  </w:abstractNum>
+  <w:abstractNum w:abstractNumId="7" w15:restartNumberingAfterBreak="0">
     <w:nsid w:val="2BB04BED"/>
     <w:multiLevelType w:val="multilevel"/>
     <w:tmpl w:val="0B40DCA8"/>
@@ -1409,7 +2905,7 @@
       </w:rPr>
     </w:lvl>
   </w:abstractNum>
-  <w:abstractNum w:abstractNumId="7" w15:restartNumberingAfterBreak="0">
+  <w:abstractNum w:abstractNumId="8" w15:restartNumberingAfterBreak="0">
     <w:nsid w:val="2BE82469"/>
     <w:multiLevelType w:val="multilevel"/>
     <w:tmpl w:val="26A29252"/>
@@ -1558,7 +3054,7 @@
       </w:rPr>
     </w:lvl>
   </w:abstractNum>
-  <w:abstractNum w:abstractNumId="8" w15:restartNumberingAfterBreak="0">
+  <w:abstractNum w:abstractNumId="9" w15:restartNumberingAfterBreak="0">
     <w:nsid w:val="2F837DC8"/>
     <w:multiLevelType w:val="hybridMultilevel"/>
     <w:tmpl w:val="88B85FDA"/>
@@ -1647,7 +3143,156 @@
       </w:pPr>
     </w:lvl>
   </w:abstractNum>
-  <w:abstractNum w:abstractNumId="9" w15:restartNumberingAfterBreak="0">
+  <w:abstractNum w:abstractNumId="10" w15:restartNumberingAfterBreak="0">
+    <w:nsid w:val="32C60C5B"/>
+    <w:multiLevelType w:val="multilevel"/>
+    <w:tmpl w:val="56B24BE2"/>
+    <w:lvl w:ilvl="0">
+      <w:start w:val="1"/>
+      <w:numFmt w:val="bullet"/>
+      <w:lvlText w:val=""/>
+      <w:lvlJc w:val="left"/>
+      <w:pPr>
+        <w:tabs>
+          <w:tab w:val="num" w:pos="720"/>
+        </w:tabs>
+        <w:ind w:left="720" w:hanging="360"/>
+      </w:pPr>
+      <w:rPr>
+        <w:rFonts w:ascii="Symbol" w:hAnsi="Symbol" w:hint="default"/>
+        <w:sz w:val="20"/>
+      </w:rPr>
+    </w:lvl>
+    <w:lvl w:ilvl="1" w:tentative="1">
+      <w:start w:val="1"/>
+      <w:numFmt w:val="bullet"/>
+      <w:lvlText w:val="o"/>
+      <w:lvlJc w:val="left"/>
+      <w:pPr>
+        <w:tabs>
+          <w:tab w:val="num" w:pos="1440"/>
+        </w:tabs>
+        <w:ind w:left="1440" w:hanging="360"/>
+      </w:pPr>
+      <w:rPr>
+        <w:rFonts w:ascii="Courier New" w:hAnsi="Courier New" w:hint="default"/>
+        <w:sz w:val="20"/>
+      </w:rPr>
+    </w:lvl>
+    <w:lvl w:ilvl="2" w:tentative="1">
+      <w:start w:val="1"/>
+      <w:numFmt w:val="bullet"/>
+      <w:lvlText w:val=""/>
+      <w:lvlJc w:val="left"/>
+      <w:pPr>
+        <w:tabs>
+          <w:tab w:val="num" w:pos="2160"/>
+        </w:tabs>
+        <w:ind w:left="2160" w:hanging="360"/>
+      </w:pPr>
+      <w:rPr>
+        <w:rFonts w:ascii="Wingdings" w:hAnsi="Wingdings" w:hint="default"/>
+        <w:sz w:val="20"/>
+      </w:rPr>
+    </w:lvl>
+    <w:lvl w:ilvl="3" w:tentative="1">
+      <w:start w:val="1"/>
+      <w:numFmt w:val="bullet"/>
+      <w:lvlText w:val=""/>
+      <w:lvlJc w:val="left"/>
+      <w:pPr>
+        <w:tabs>
+          <w:tab w:val="num" w:pos="2880"/>
+        </w:tabs>
+        <w:ind w:left="2880" w:hanging="360"/>
+      </w:pPr>
+      <w:rPr>
+        <w:rFonts w:ascii="Wingdings" w:hAnsi="Wingdings" w:hint="default"/>
+        <w:sz w:val="20"/>
+      </w:rPr>
+    </w:lvl>
+    <w:lvl w:ilvl="4" w:tentative="1">
+      <w:start w:val="1"/>
+      <w:numFmt w:val="bullet"/>
+      <w:lvlText w:val=""/>
+      <w:lvlJc w:val="left"/>
+      <w:pPr>
+        <w:tabs>
+          <w:tab w:val="num" w:pos="3600"/>
+        </w:tabs>
+        <w:ind w:left="3600" w:hanging="360"/>
+      </w:pPr>
+      <w:rPr>
+        <w:rFonts w:ascii="Wingdings" w:hAnsi="Wingdings" w:hint="default"/>
+        <w:sz w:val="20"/>
+      </w:rPr>
+    </w:lvl>
+    <w:lvl w:ilvl="5" w:tentative="1">
+      <w:start w:val="1"/>
+      <w:numFmt w:val="bullet"/>
+      <w:lvlText w:val=""/>
+      <w:lvlJc w:val="left"/>
+      <w:pPr>
+        <w:tabs>
+          <w:tab w:val="num" w:pos="4320"/>
+        </w:tabs>
+        <w:ind w:left="4320" w:hanging="360"/>
+      </w:pPr>
+      <w:rPr>
+        <w:rFonts w:ascii="Wingdings" w:hAnsi="Wingdings" w:hint="default"/>
+        <w:sz w:val="20"/>
+      </w:rPr>
+    </w:lvl>
+    <w:lvl w:ilvl="6" w:tentative="1">
+      <w:start w:val="1"/>
+      <w:numFmt w:val="bullet"/>
+      <w:lvlText w:val=""/>
+      <w:lvlJc w:val="left"/>
+      <w:pPr>
+        <w:tabs>
+          <w:tab w:val="num" w:pos="5040"/>
+        </w:tabs>
+        <w:ind w:left="5040" w:hanging="360"/>
+      </w:pPr>
+      <w:rPr>
+        <w:rFonts w:ascii="Wingdings" w:hAnsi="Wingdings" w:hint="default"/>
+        <w:sz w:val="20"/>
+      </w:rPr>
+    </w:lvl>
+    <w:lvl w:ilvl="7" w:tentative="1">
+      <w:start w:val="1"/>
+      <w:numFmt w:val="bullet"/>
+      <w:lvlText w:val=""/>
+      <w:lvlJc w:val="left"/>
+      <w:pPr>
+        <w:tabs>
+          <w:tab w:val="num" w:pos="5760"/>
+        </w:tabs>
+        <w:ind w:left="5760" w:hanging="360"/>
+      </w:pPr>
+      <w:rPr>
+        <w:rFonts w:ascii="Wingdings" w:hAnsi="Wingdings" w:hint="default"/>
+        <w:sz w:val="20"/>
+      </w:rPr>
+    </w:lvl>
+    <w:lvl w:ilvl="8" w:tentative="1">
+      <w:start w:val="1"/>
+      <w:numFmt w:val="bullet"/>
+      <w:lvlText w:val=""/>
+      <w:lvlJc w:val="left"/>
+      <w:pPr>
+        <w:tabs>
+          <w:tab w:val="num" w:pos="6480"/>
+        </w:tabs>
+        <w:ind w:left="6480" w:hanging="360"/>
+      </w:pPr>
+      <w:rPr>
+        <w:rFonts w:ascii="Wingdings" w:hAnsi="Wingdings" w:hint="default"/>
+        <w:sz w:val="20"/>
+      </w:rPr>
+    </w:lvl>
+  </w:abstractNum>
+  <w:abstractNum w:abstractNumId="11" w15:restartNumberingAfterBreak="0">
     <w:nsid w:val="3564046A"/>
     <w:multiLevelType w:val="multilevel"/>
     <w:tmpl w:val="1132F8BE"/>
@@ -1796,7 +3441,7 @@
       </w:rPr>
     </w:lvl>
   </w:abstractNum>
-  <w:abstractNum w:abstractNumId="10" w15:restartNumberingAfterBreak="0">
+  <w:abstractNum w:abstractNumId="12" w15:restartNumberingAfterBreak="0">
     <w:nsid w:val="39274729"/>
     <w:multiLevelType w:val="multilevel"/>
     <w:tmpl w:val="79C8543A"/>
@@ -1945,7 +3590,7 @@
       </w:rPr>
     </w:lvl>
   </w:abstractNum>
-  <w:abstractNum w:abstractNumId="11" w15:restartNumberingAfterBreak="0">
+  <w:abstractNum w:abstractNumId="13" w15:restartNumberingAfterBreak="0">
     <w:nsid w:val="3D275424"/>
     <w:multiLevelType w:val="hybridMultilevel"/>
     <w:tmpl w:val="49C226FC"/>
@@ -2058,7 +3703,156 @@
       </w:rPr>
     </w:lvl>
   </w:abstractNum>
-  <w:abstractNum w:abstractNumId="12" w15:restartNumberingAfterBreak="0">
+  <w:abstractNum w:abstractNumId="14" w15:restartNumberingAfterBreak="0">
+    <w:nsid w:val="402A4326"/>
+    <w:multiLevelType w:val="multilevel"/>
+    <w:tmpl w:val="A270160C"/>
+    <w:lvl w:ilvl="0">
+      <w:start w:val="1"/>
+      <w:numFmt w:val="bullet"/>
+      <w:lvlText w:val=""/>
+      <w:lvlJc w:val="left"/>
+      <w:pPr>
+        <w:tabs>
+          <w:tab w:val="num" w:pos="720"/>
+        </w:tabs>
+        <w:ind w:left="720" w:hanging="360"/>
+      </w:pPr>
+      <w:rPr>
+        <w:rFonts w:ascii="Symbol" w:hAnsi="Symbol" w:hint="default"/>
+        <w:sz w:val="20"/>
+      </w:rPr>
+    </w:lvl>
+    <w:lvl w:ilvl="1" w:tentative="1">
+      <w:start w:val="1"/>
+      <w:numFmt w:val="bullet"/>
+      <w:lvlText w:val="o"/>
+      <w:lvlJc w:val="left"/>
+      <w:pPr>
+        <w:tabs>
+          <w:tab w:val="num" w:pos="1440"/>
+        </w:tabs>
+        <w:ind w:left="1440" w:hanging="360"/>
+      </w:pPr>
+      <w:rPr>
+        <w:rFonts w:ascii="Courier New" w:hAnsi="Courier New" w:hint="default"/>
+        <w:sz w:val="20"/>
+      </w:rPr>
+    </w:lvl>
+    <w:lvl w:ilvl="2" w:tentative="1">
+      <w:start w:val="1"/>
+      <w:numFmt w:val="bullet"/>
+      <w:lvlText w:val=""/>
+      <w:lvlJc w:val="left"/>
+      <w:pPr>
+        <w:tabs>
+          <w:tab w:val="num" w:pos="2160"/>
+        </w:tabs>
+        <w:ind w:left="2160" w:hanging="360"/>
+      </w:pPr>
+      <w:rPr>
+        <w:rFonts w:ascii="Wingdings" w:hAnsi="Wingdings" w:hint="default"/>
+        <w:sz w:val="20"/>
+      </w:rPr>
+    </w:lvl>
+    <w:lvl w:ilvl="3" w:tentative="1">
+      <w:start w:val="1"/>
+      <w:numFmt w:val="bullet"/>
+      <w:lvlText w:val=""/>
+      <w:lvlJc w:val="left"/>
+      <w:pPr>
+        <w:tabs>
+          <w:tab w:val="num" w:pos="2880"/>
+        </w:tabs>
+        <w:ind w:left="2880" w:hanging="360"/>
+      </w:pPr>
+      <w:rPr>
+        <w:rFonts w:ascii="Wingdings" w:hAnsi="Wingdings" w:hint="default"/>
+        <w:sz w:val="20"/>
+      </w:rPr>
+    </w:lvl>
+    <w:lvl w:ilvl="4" w:tentative="1">
+      <w:start w:val="1"/>
+      <w:numFmt w:val="bullet"/>
+      <w:lvlText w:val=""/>
+      <w:lvlJc w:val="left"/>
+      <w:pPr>
+        <w:tabs>
+          <w:tab w:val="num" w:pos="3600"/>
+        </w:tabs>
+        <w:ind w:left="3600" w:hanging="360"/>
+      </w:pPr>
+      <w:rPr>
+        <w:rFonts w:ascii="Wingdings" w:hAnsi="Wingdings" w:hint="default"/>
+        <w:sz w:val="20"/>
+      </w:rPr>
+    </w:lvl>
+    <w:lvl w:ilvl="5" w:tentative="1">
+      <w:start w:val="1"/>
+      <w:numFmt w:val="bullet"/>
+      <w:lvlText w:val=""/>
+      <w:lvlJc w:val="left"/>
+      <w:pPr>
+        <w:tabs>
+          <w:tab w:val="num" w:pos="4320"/>
+        </w:tabs>
+        <w:ind w:left="4320" w:hanging="360"/>
+      </w:pPr>
+      <w:rPr>
+        <w:rFonts w:ascii="Wingdings" w:hAnsi="Wingdings" w:hint="default"/>
+        <w:sz w:val="20"/>
+      </w:rPr>
+    </w:lvl>
+    <w:lvl w:ilvl="6" w:tentative="1">
+      <w:start w:val="1"/>
+      <w:numFmt w:val="bullet"/>
+      <w:lvlText w:val=""/>
+      <w:lvlJc w:val="left"/>
+      <w:pPr>
+        <w:tabs>
+          <w:tab w:val="num" w:pos="5040"/>
+        </w:tabs>
+        <w:ind w:left="5040" w:hanging="360"/>
+      </w:pPr>
+      <w:rPr>
+        <w:rFonts w:ascii="Wingdings" w:hAnsi="Wingdings" w:hint="default"/>
+        <w:sz w:val="20"/>
+      </w:rPr>
+    </w:lvl>
+    <w:lvl w:ilvl="7" w:tentative="1">
+      <w:start w:val="1"/>
+      <w:numFmt w:val="bullet"/>
+      <w:lvlText w:val=""/>
+      <w:lvlJc w:val="left"/>
+      <w:pPr>
+        <w:tabs>
+          <w:tab w:val="num" w:pos="5760"/>
+        </w:tabs>
+        <w:ind w:left="5760" w:hanging="360"/>
+      </w:pPr>
+      <w:rPr>
+        <w:rFonts w:ascii="Wingdings" w:hAnsi="Wingdings" w:hint="default"/>
+        <w:sz w:val="20"/>
+      </w:rPr>
+    </w:lvl>
+    <w:lvl w:ilvl="8" w:tentative="1">
+      <w:start w:val="1"/>
+      <w:numFmt w:val="bullet"/>
+      <w:lvlText w:val=""/>
+      <w:lvlJc w:val="left"/>
+      <w:pPr>
+        <w:tabs>
+          <w:tab w:val="num" w:pos="6480"/>
+        </w:tabs>
+        <w:ind w:left="6480" w:hanging="360"/>
+      </w:pPr>
+      <w:rPr>
+        <w:rFonts w:ascii="Wingdings" w:hAnsi="Wingdings" w:hint="default"/>
+        <w:sz w:val="20"/>
+      </w:rPr>
+    </w:lvl>
+  </w:abstractNum>
+  <w:abstractNum w:abstractNumId="15" w15:restartNumberingAfterBreak="0">
     <w:nsid w:val="420B6A65"/>
     <w:multiLevelType w:val="hybridMultilevel"/>
     <w:tmpl w:val="173EE68E"/>
@@ -2147,7 +3941,7 @@
       </w:pPr>
     </w:lvl>
   </w:abstractNum>
-  <w:abstractNum w:abstractNumId="13" w15:restartNumberingAfterBreak="0">
+  <w:abstractNum w:abstractNumId="16" w15:restartNumberingAfterBreak="0">
     <w:nsid w:val="42225BEA"/>
     <w:multiLevelType w:val="multilevel"/>
     <w:tmpl w:val="EC5AC728"/>
@@ -2296,7 +4090,7 @@
       </w:rPr>
     </w:lvl>
   </w:abstractNum>
-  <w:abstractNum w:abstractNumId="14" w15:restartNumberingAfterBreak="0">
+  <w:abstractNum w:abstractNumId="17" w15:restartNumberingAfterBreak="0">
     <w:nsid w:val="48813D2E"/>
     <w:multiLevelType w:val="multilevel"/>
     <w:tmpl w:val="84BA4A2A"/>
@@ -2445,7 +4239,7 @@
       </w:rPr>
     </w:lvl>
   </w:abstractNum>
-  <w:abstractNum w:abstractNumId="15" w15:restartNumberingAfterBreak="0">
+  <w:abstractNum w:abstractNumId="18" w15:restartNumberingAfterBreak="0">
     <w:nsid w:val="4AE915C6"/>
     <w:multiLevelType w:val="multilevel"/>
     <w:tmpl w:val="250C8EEC"/>
@@ -2594,7 +4388,7 @@
       </w:rPr>
     </w:lvl>
   </w:abstractNum>
-  <w:abstractNum w:abstractNumId="16" w15:restartNumberingAfterBreak="0">
+  <w:abstractNum w:abstractNumId="19" w15:restartNumberingAfterBreak="0">
     <w:nsid w:val="4C8B3518"/>
     <w:multiLevelType w:val="multilevel"/>
     <w:tmpl w:val="293A2202"/>
@@ -2743,7 +4537,7 @@
       </w:rPr>
     </w:lvl>
   </w:abstractNum>
-  <w:abstractNum w:abstractNumId="17" w15:restartNumberingAfterBreak="0">
+  <w:abstractNum w:abstractNumId="20" w15:restartNumberingAfterBreak="0">
     <w:nsid w:val="4FD853C0"/>
     <w:multiLevelType w:val="multilevel"/>
     <w:tmpl w:val="7EA26E9E"/>
@@ -2892,7 +4686,7 @@
       </w:rPr>
     </w:lvl>
   </w:abstractNum>
-  <w:abstractNum w:abstractNumId="18" w15:restartNumberingAfterBreak="0">
+  <w:abstractNum w:abstractNumId="21" w15:restartNumberingAfterBreak="0">
     <w:nsid w:val="4FF953D9"/>
     <w:multiLevelType w:val="multilevel"/>
     <w:tmpl w:val="02A6F818"/>
@@ -3041,7 +4835,7 @@
       </w:rPr>
     </w:lvl>
   </w:abstractNum>
-  <w:abstractNum w:abstractNumId="19" w15:restartNumberingAfterBreak="0">
+  <w:abstractNum w:abstractNumId="22" w15:restartNumberingAfterBreak="0">
     <w:nsid w:val="51C242BE"/>
     <w:multiLevelType w:val="multilevel"/>
     <w:tmpl w:val="7AFA5D7E"/>
@@ -3190,7 +4984,7 @@
       </w:rPr>
     </w:lvl>
   </w:abstractNum>
-  <w:abstractNum w:abstractNumId="20" w15:restartNumberingAfterBreak="0">
+  <w:abstractNum w:abstractNumId="23" w15:restartNumberingAfterBreak="0">
     <w:nsid w:val="51D64E06"/>
     <w:multiLevelType w:val="multilevel"/>
     <w:tmpl w:val="E6F60F70"/>
@@ -3339,7 +5133,7 @@
       </w:rPr>
     </w:lvl>
   </w:abstractNum>
-  <w:abstractNum w:abstractNumId="21" w15:restartNumberingAfterBreak="0">
+  <w:abstractNum w:abstractNumId="24" w15:restartNumberingAfterBreak="0">
     <w:nsid w:val="52A709C0"/>
     <w:multiLevelType w:val="multilevel"/>
     <w:tmpl w:val="627C96B6"/>
@@ -3452,7 +5246,7 @@
       </w:pPr>
     </w:lvl>
   </w:abstractNum>
-  <w:abstractNum w:abstractNumId="22" w15:restartNumberingAfterBreak="0">
+  <w:abstractNum w:abstractNumId="25" w15:restartNumberingAfterBreak="0">
     <w:nsid w:val="54283BB3"/>
     <w:multiLevelType w:val="multilevel"/>
     <w:tmpl w:val="F000B11A"/>
@@ -3601,7 +5395,7 @@
       </w:rPr>
     </w:lvl>
   </w:abstractNum>
-  <w:abstractNum w:abstractNumId="23" w15:restartNumberingAfterBreak="0">
+  <w:abstractNum w:abstractNumId="26" w15:restartNumberingAfterBreak="0">
     <w:nsid w:val="577A396F"/>
     <w:multiLevelType w:val="multilevel"/>
     <w:tmpl w:val="50925818"/>
@@ -3750,7 +5544,7 @@
       </w:rPr>
     </w:lvl>
   </w:abstractNum>
-  <w:abstractNum w:abstractNumId="24" w15:restartNumberingAfterBreak="0">
+  <w:abstractNum w:abstractNumId="27" w15:restartNumberingAfterBreak="0">
     <w:nsid w:val="5B8E1460"/>
     <w:multiLevelType w:val="multilevel"/>
     <w:tmpl w:val="9E84C2EC"/>
@@ -3863,7 +5657,7 @@
       </w:pPr>
     </w:lvl>
   </w:abstractNum>
-  <w:abstractNum w:abstractNumId="25" w15:restartNumberingAfterBreak="0">
+  <w:abstractNum w:abstractNumId="28" w15:restartNumberingAfterBreak="0">
     <w:nsid w:val="5D265374"/>
     <w:multiLevelType w:val="multilevel"/>
     <w:tmpl w:val="935A7FEA"/>
@@ -4012,7 +5806,7 @@
       </w:rPr>
     </w:lvl>
   </w:abstractNum>
-  <w:abstractNum w:abstractNumId="26" w15:restartNumberingAfterBreak="0">
+  <w:abstractNum w:abstractNumId="29" w15:restartNumberingAfterBreak="0">
     <w:nsid w:val="68460D16"/>
     <w:multiLevelType w:val="multilevel"/>
     <w:tmpl w:val="92FAE588"/>
@@ -4161,7 +5955,7 @@
       </w:rPr>
     </w:lvl>
   </w:abstractNum>
-  <w:abstractNum w:abstractNumId="27" w15:restartNumberingAfterBreak="0">
+  <w:abstractNum w:abstractNumId="30" w15:restartNumberingAfterBreak="0">
     <w:nsid w:val="6D2D357B"/>
     <w:multiLevelType w:val="multilevel"/>
     <w:tmpl w:val="DCF654D2"/>
@@ -4274,7 +6068,7 @@
       </w:pPr>
     </w:lvl>
   </w:abstractNum>
-  <w:abstractNum w:abstractNumId="28" w15:restartNumberingAfterBreak="0">
+  <w:abstractNum w:abstractNumId="31" w15:restartNumberingAfterBreak="0">
     <w:nsid w:val="6F4C02CC"/>
     <w:multiLevelType w:val="multilevel"/>
     <w:tmpl w:val="DF3ED524"/>
@@ -4423,7 +6217,7 @@
       </w:rPr>
     </w:lvl>
   </w:abstractNum>
-  <w:abstractNum w:abstractNumId="29" w15:restartNumberingAfterBreak="0">
+  <w:abstractNum w:abstractNumId="32" w15:restartNumberingAfterBreak="0">
     <w:nsid w:val="70496F89"/>
     <w:multiLevelType w:val="multilevel"/>
     <w:tmpl w:val="79BA3ABA"/>
@@ -4572,7 +6366,7 @@
       </w:rPr>
     </w:lvl>
   </w:abstractNum>
-  <w:abstractNum w:abstractNumId="30" w15:restartNumberingAfterBreak="0">
+  <w:abstractNum w:abstractNumId="33" w15:restartNumberingAfterBreak="0">
     <w:nsid w:val="70652BE6"/>
     <w:multiLevelType w:val="multilevel"/>
     <w:tmpl w:val="BDCA9A78"/>
@@ -4721,7 +6515,7 @@
       </w:rPr>
     </w:lvl>
   </w:abstractNum>
-  <w:abstractNum w:abstractNumId="31" w15:restartNumberingAfterBreak="0">
+  <w:abstractNum w:abstractNumId="34" w15:restartNumberingAfterBreak="0">
     <w:nsid w:val="716A3086"/>
     <w:multiLevelType w:val="hybridMultilevel"/>
     <w:tmpl w:val="50A68130"/>
@@ -4810,7 +6604,7 @@
       </w:pPr>
     </w:lvl>
   </w:abstractNum>
-  <w:abstractNum w:abstractNumId="32" w15:restartNumberingAfterBreak="0">
+  <w:abstractNum w:abstractNumId="35" w15:restartNumberingAfterBreak="0">
     <w:nsid w:val="76A43B61"/>
     <w:multiLevelType w:val="multilevel"/>
     <w:tmpl w:val="7EAAB2CA"/>
@@ -4959,7 +6753,7 @@
       </w:rPr>
     </w:lvl>
   </w:abstractNum>
-  <w:abstractNum w:abstractNumId="33" w15:restartNumberingAfterBreak="0">
+  <w:abstractNum w:abstractNumId="36" w15:restartNumberingAfterBreak="0">
     <w:nsid w:val="7A637752"/>
     <w:multiLevelType w:val="multilevel"/>
     <w:tmpl w:val="C390E9D0"/>
@@ -5108,7 +6902,7 @@
       </w:rPr>
     </w:lvl>
   </w:abstractNum>
-  <w:abstractNum w:abstractNumId="34" w15:restartNumberingAfterBreak="0">
+  <w:abstractNum w:abstractNumId="37" w15:restartNumberingAfterBreak="0">
     <w:nsid w:val="7BA23D7A"/>
     <w:multiLevelType w:val="multilevel"/>
     <w:tmpl w:val="4934A7C6"/>
@@ -5257,7 +7051,7 @@
       </w:rPr>
     </w:lvl>
   </w:abstractNum>
-  <w:abstractNum w:abstractNumId="35" w15:restartNumberingAfterBreak="0">
+  <w:abstractNum w:abstractNumId="38" w15:restartNumberingAfterBreak="0">
     <w:nsid w:val="7D697935"/>
     <w:multiLevelType w:val="multilevel"/>
     <w:tmpl w:val="5F605A44"/>
@@ -5406,7 +7200,7 @@
       </w:rPr>
     </w:lvl>
   </w:abstractNum>
-  <w:abstractNum w:abstractNumId="36" w15:restartNumberingAfterBreak="0">
+  <w:abstractNum w:abstractNumId="39" w15:restartNumberingAfterBreak="0">
     <w:nsid w:val="7F4B463B"/>
     <w:multiLevelType w:val="multilevel"/>
     <w:tmpl w:val="F08CDF7C"/>
@@ -5520,115 +7314,124 @@
     </w:lvl>
   </w:abstractNum>
   <w:num w:numId="1" w16cid:durableId="571349344">
-    <w:abstractNumId w:val="27"/>
+    <w:abstractNumId w:val="30"/>
   </w:num>
   <w:num w:numId="2" w16cid:durableId="1976372375">
-    <w:abstractNumId w:val="12"/>
+    <w:abstractNumId w:val="15"/>
   </w:num>
   <w:num w:numId="3" w16cid:durableId="1998485932">
-    <w:abstractNumId w:val="7"/>
+    <w:abstractNumId w:val="8"/>
   </w:num>
   <w:num w:numId="4" w16cid:durableId="183791066">
-    <w:abstractNumId w:val="26"/>
+    <w:abstractNumId w:val="29"/>
   </w:num>
   <w:num w:numId="5" w16cid:durableId="52774440">
-    <w:abstractNumId w:val="29"/>
+    <w:abstractNumId w:val="32"/>
   </w:num>
   <w:num w:numId="6" w16cid:durableId="1099760397">
-    <w:abstractNumId w:val="18"/>
+    <w:abstractNumId w:val="21"/>
   </w:num>
   <w:num w:numId="7" w16cid:durableId="1641305258">
-    <w:abstractNumId w:val="8"/>
+    <w:abstractNumId w:val="9"/>
   </w:num>
   <w:num w:numId="8" w16cid:durableId="1148131820">
-    <w:abstractNumId w:val="31"/>
+    <w:abstractNumId w:val="34"/>
   </w:num>
   <w:num w:numId="9" w16cid:durableId="68623712">
-    <w:abstractNumId w:val="19"/>
+    <w:abstractNumId w:val="22"/>
   </w:num>
   <w:num w:numId="10" w16cid:durableId="911352611">
-    <w:abstractNumId w:val="22"/>
+    <w:abstractNumId w:val="25"/>
   </w:num>
   <w:num w:numId="11" w16cid:durableId="1641419030">
-    <w:abstractNumId w:val="17"/>
+    <w:abstractNumId w:val="20"/>
   </w:num>
   <w:num w:numId="12" w16cid:durableId="1542280715">
-    <w:abstractNumId w:val="35"/>
+    <w:abstractNumId w:val="38"/>
   </w:num>
   <w:num w:numId="13" w16cid:durableId="1589580329">
     <w:abstractNumId w:val="0"/>
   </w:num>
   <w:num w:numId="14" w16cid:durableId="1987464535">
-    <w:abstractNumId w:val="15"/>
+    <w:abstractNumId w:val="18"/>
   </w:num>
   <w:num w:numId="15" w16cid:durableId="68038691">
     <w:abstractNumId w:val="3"/>
   </w:num>
   <w:num w:numId="16" w16cid:durableId="1378894371">
-    <w:abstractNumId w:val="9"/>
+    <w:abstractNumId w:val="11"/>
   </w:num>
   <w:num w:numId="17" w16cid:durableId="1834568190">
-    <w:abstractNumId w:val="28"/>
+    <w:abstractNumId w:val="31"/>
   </w:num>
   <w:num w:numId="18" w16cid:durableId="953753618">
     <w:abstractNumId w:val="4"/>
   </w:num>
   <w:num w:numId="19" w16cid:durableId="1070889655">
-    <w:abstractNumId w:val="16"/>
+    <w:abstractNumId w:val="19"/>
   </w:num>
   <w:num w:numId="20" w16cid:durableId="367725829">
-    <w:abstractNumId w:val="10"/>
+    <w:abstractNumId w:val="12"/>
   </w:num>
   <w:num w:numId="21" w16cid:durableId="1677028070">
     <w:abstractNumId w:val="5"/>
   </w:num>
   <w:num w:numId="22" w16cid:durableId="1864398357">
-    <w:abstractNumId w:val="34"/>
+    <w:abstractNumId w:val="37"/>
   </w:num>
   <w:num w:numId="23" w16cid:durableId="1513762902">
-    <w:abstractNumId w:val="30"/>
+    <w:abstractNumId w:val="33"/>
   </w:num>
   <w:num w:numId="24" w16cid:durableId="935750255">
-    <w:abstractNumId w:val="25"/>
+    <w:abstractNumId w:val="28"/>
   </w:num>
   <w:num w:numId="25" w16cid:durableId="888344242">
     <w:abstractNumId w:val="1"/>
   </w:num>
   <w:num w:numId="26" w16cid:durableId="1373575035">
-    <w:abstractNumId w:val="21"/>
+    <w:abstractNumId w:val="24"/>
   </w:num>
   <w:num w:numId="27" w16cid:durableId="745738">
-    <w:abstractNumId w:val="6"/>
+    <w:abstractNumId w:val="7"/>
   </w:num>
   <w:num w:numId="28" w16cid:durableId="24721920">
-    <w:abstractNumId w:val="24"/>
+    <w:abstractNumId w:val="27"/>
   </w:num>
   <w:num w:numId="29" w16cid:durableId="686369722">
-    <w:abstractNumId w:val="33"/>
+    <w:abstractNumId w:val="36"/>
   </w:num>
   <w:num w:numId="30" w16cid:durableId="683167548">
-    <w:abstractNumId w:val="23"/>
+    <w:abstractNumId w:val="26"/>
   </w:num>
   <w:num w:numId="31" w16cid:durableId="1841971159">
-    <w:abstractNumId w:val="36"/>
+    <w:abstractNumId w:val="39"/>
   </w:num>
   <w:num w:numId="32" w16cid:durableId="629357563">
-    <w:abstractNumId w:val="14"/>
+    <w:abstractNumId w:val="17"/>
   </w:num>
   <w:num w:numId="33" w16cid:durableId="93789271">
-    <w:abstractNumId w:val="11"/>
+    <w:abstractNumId w:val="13"/>
   </w:num>
   <w:num w:numId="34" w16cid:durableId="291907574">
     <w:abstractNumId w:val="2"/>
   </w:num>
   <w:num w:numId="35" w16cid:durableId="1560743086">
-    <w:abstractNumId w:val="32"/>
+    <w:abstractNumId w:val="35"/>
   </w:num>
   <w:num w:numId="36" w16cid:durableId="984117142">
-    <w:abstractNumId w:val="20"/>
+    <w:abstractNumId w:val="23"/>
   </w:num>
   <w:num w:numId="37" w16cid:durableId="583611843">
-    <w:abstractNumId w:val="13"/>
+    <w:abstractNumId w:val="16"/>
+  </w:num>
+  <w:num w:numId="38" w16cid:durableId="1336491590">
+    <w:abstractNumId w:val="6"/>
+  </w:num>
+  <w:num w:numId="39" w16cid:durableId="85082060">
+    <w:abstractNumId w:val="14"/>
+  </w:num>
+  <w:num w:numId="40" w16cid:durableId="1309632585">
+    <w:abstractNumId w:val="10"/>
   </w:num>
 </w:numbering>
 </file>

</xml_diff>